<commit_message>
Pruebas del panel admin, evidencia actualizada y plan de trabajo
- CP-45 a CP-48 cubren el resumen de operacion, el detalle de cuenta y el
  historial global con sus filtros, que se habian agregado sin pruebas.
- Reejecutada la bateria: 48 casos disenados, 51 pruebas, 51 aprobadas.
  Cobertura 89,41 % de sentencias y 82,19 % de ramas.
- Plan de calidad regenerado con los casos y defectos nuevos (D-12, D-13).
- Se agrega docs/PLAN_DE_TRABAJO.md con la arquitectura propuesta para el
  siguiente incremento: API, base de datos y despliegue.

Co-Authored-By: Claude Opus 5 <noreply@anthropic.com>
</commit_message>
<xml_diff>
--- a/docs/Plan_de_calidad_y_pruebas.docx
+++ b/docs/Plan_de_calidad_y_pruebas.docx
@@ -994,7 +994,7 @@
                 <w:sz w:val="20"/>
                 <w:szCs w:val="20"/>
               </w:rPr>
-              <w:t xml:space="preserve">Cobertura de ramas ≥ 80 % sobre la lógica de dominio extraída de Fintec.html. Medido: 84,09 % de ramas, 87,04 % de sentencias y 82,53 % de funciones (Vitest 3.2.4 + v8).</w:t>
+              <w:t xml:space="preserve">Cobertura de ramas ≥ 80 % sobre la lógica de dominio extraída de Fintec.html. Medido: 82,19 % de ramas, 89,41 % de sentencias y 84,21 % de funciones (Vitest 3.2.4 + v8).</w:t>
             </w:r>
           </w:p>
         </w:tc>
@@ -10460,6 +10460,2305 @@
           </w:p>
         </w:tc>
       </w:tr>
+      <w:tr>
+        <w:tc>
+          <w:tcPr>
+            <w:tcW w:type="dxa" w:w="600"/>
+            <w:shd w:fill="F3F7FC" w:color="auto" w:val="clear"/>
+          </w:tcPr>
+          <w:p>
+            <w:pPr>
+              <w:spacing w:after="60" w:line="300"/>
+              <w:jc w:val="left"/>
+            </w:pPr>
+            <w:r>
+              <w:rPr>
+                <w:rFonts w:ascii="Calibri" w:cs="Calibri" w:eastAsia="Calibri" w:hAnsi="Calibri"/>
+                <w:b w:val="false"/>
+                <w:bCs w:val="false"/>
+                <w:color w:val="10213F"/>
+                <w:sz w:val="20"/>
+                <w:szCs w:val="20"/>
+              </w:rPr>
+              <w:t xml:space="preserve">CP-38</w:t>
+            </w:r>
+          </w:p>
+        </w:tc>
+        <w:tc>
+          <w:tcPr>
+            <w:tcW w:type="dxa" w:w="900"/>
+            <w:shd w:fill="F3F7FC" w:color="auto" w:val="clear"/>
+          </w:tcPr>
+          <w:p>
+            <w:pPr>
+              <w:spacing w:after="60" w:line="300"/>
+              <w:jc w:val="left"/>
+            </w:pPr>
+            <w:r>
+              <w:rPr>
+                <w:rFonts w:ascii="Calibri" w:cs="Calibri" w:eastAsia="Calibri" w:hAnsi="Calibri"/>
+                <w:b w:val="false"/>
+                <w:bCs w:val="false"/>
+                <w:color w:val="10213F"/>
+                <w:sz w:val="20"/>
+                <w:szCs w:val="20"/>
+              </w:rPr>
+              <w:t xml:space="preserve">RF-04 (topes) / Esc.1</w:t>
+            </w:r>
+          </w:p>
+        </w:tc>
+        <w:tc>
+          <w:tcPr>
+            <w:tcW w:type="dxa" w:w="900"/>
+            <w:shd w:fill="F3F7FC" w:color="auto" w:val="clear"/>
+          </w:tcPr>
+          <w:p>
+            <w:pPr>
+              <w:spacing w:after="60" w:line="300"/>
+              <w:jc w:val="left"/>
+            </w:pPr>
+            <w:r>
+              <w:rPr>
+                <w:rFonts w:ascii="Calibri" w:cs="Calibri" w:eastAsia="Calibri" w:hAnsi="Calibri"/>
+                <w:b w:val="false"/>
+                <w:bCs w:val="false"/>
+                <w:color w:val="10213F"/>
+                <w:sz w:val="20"/>
+                <w:szCs w:val="20"/>
+              </w:rPr>
+              <w:t xml:space="preserve">Válido (confirmación)</w:t>
+            </w:r>
+          </w:p>
+        </w:tc>
+        <w:tc>
+          <w:tcPr>
+            <w:tcW w:type="dxa" w:w="1200"/>
+            <w:shd w:fill="F3F7FC" w:color="auto" w:val="clear"/>
+          </w:tcPr>
+          <w:p>
+            <w:pPr>
+              <w:spacing w:after="60" w:line="300"/>
+              <w:jc w:val="left"/>
+            </w:pPr>
+            <w:r>
+              <w:rPr>
+                <w:rFonts w:ascii="Calibri" w:cs="Calibri" w:eastAsia="Calibri" w:hAnsi="Calibri"/>
+                <w:b w:val="false"/>
+                <w:bCs w:val="false"/>
+                <w:color w:val="10213F"/>
+                <w:sz w:val="20"/>
+                <w:szCs w:val="20"/>
+              </w:rPr>
+              <w:t xml:space="preserve">María autenticada con disponible $2.450.000</w:t>
+            </w:r>
+          </w:p>
+        </w:tc>
+        <w:tc>
+          <w:tcPr>
+            <w:tcW w:type="dxa" w:w="1200"/>
+            <w:shd w:fill="F3F7FC" w:color="auto" w:val="clear"/>
+          </w:tcPr>
+          <w:p>
+            <w:pPr>
+              <w:spacing w:after="60" w:line="300"/>
+              <w:jc w:val="left"/>
+            </w:pPr>
+            <w:r>
+              <w:rPr>
+                <w:rFonts w:ascii="Calibri" w:cs="Calibri" w:eastAsia="Calibri" w:hAnsi="Calibri"/>
+                <w:b w:val="false"/>
+                <w:bCs w:val="false"/>
+                <w:color w:val="10213F"/>
+                <w:sz w:val="20"/>
+                <w:szCs w:val="20"/>
+              </w:rPr>
+              <w:t xml:space="preserve">Cuenta destino 009-441-220 escrita a mano, monto $100.000</w:t>
+            </w:r>
+          </w:p>
+        </w:tc>
+        <w:tc>
+          <w:tcPr>
+            <w:tcW w:type="dxa" w:w="1400"/>
+            <w:shd w:fill="F3F7FC" w:color="auto" w:val="clear"/>
+          </w:tcPr>
+          <w:p>
+            <w:pPr>
+              <w:spacing w:after="60" w:line="300"/>
+              <w:jc w:val="left"/>
+            </w:pPr>
+            <w:r>
+              <w:rPr>
+                <w:rFonts w:ascii="Calibri" w:cs="Calibri" w:eastAsia="Calibri" w:hAnsi="Calibri"/>
+                <w:b w:val="false"/>
+                <w:bCs w:val="false"/>
+                <w:color w:val="10213F"/>
+                <w:sz w:val="20"/>
+                <w:szCs w:val="20"/>
+              </w:rPr>
+              <w:t xml:space="preserve">1. Login María. 2. Ir a Transferir. 3. Escribir la cuenta destino y el monto. 4. Transferir</w:t>
+            </w:r>
+          </w:p>
+        </w:tc>
+        <w:tc>
+          <w:tcPr>
+            <w:tcW w:type="dxa" w:w="2200"/>
+            <w:shd w:fill="F3F7FC" w:color="auto" w:val="clear"/>
+          </w:tcPr>
+          <w:p>
+            <w:pPr>
+              <w:spacing w:after="60" w:line="300"/>
+              <w:jc w:val="left"/>
+            </w:pPr>
+            <w:r>
+              <w:rPr>
+                <w:rFonts w:ascii="Calibri" w:cs="Calibri" w:eastAsia="Calibri" w:hAnsi="Calibri"/>
+                <w:b w:val="false"/>
+                <w:bCs w:val="false"/>
+                <w:color w:val="10213F"/>
+                <w:sz w:val="20"/>
+                <w:szCs w:val="20"/>
+              </w:rPr>
+              <w:t xml:space="preserve">El panel de confirmación muestra el nombre del titular "Laura Díaz" y el monto $100.000; aún no se mueve dinero (disponible María = $2.450.000, Laura = $3.800.000).</w:t>
+            </w:r>
+          </w:p>
+        </w:tc>
+        <w:tc>
+          <w:tcPr>
+            <w:tcW w:type="dxa" w:w="800"/>
+            <w:shd w:fill="F3F7FC" w:color="auto" w:val="clear"/>
+          </w:tcPr>
+          <w:p>
+            <w:pPr>
+              <w:spacing w:after="60" w:line="300"/>
+              <w:jc w:val="left"/>
+            </w:pPr>
+            <w:r>
+              <w:rPr>
+                <w:rFonts w:ascii="Calibri" w:cs="Calibri" w:eastAsia="Calibri" w:hAnsi="Calibri"/>
+                <w:b w:val="false"/>
+                <w:bCs w:val="false"/>
+                <w:color w:val="10213F"/>
+                <w:sz w:val="20"/>
+                <w:szCs w:val="20"/>
+              </w:rPr>
+              <w:t xml:space="preserve">RF-04 (topes)</w:t>
+            </w:r>
+          </w:p>
+        </w:tc>
+        <w:tc>
+          <w:tcPr>
+            <w:tcW w:type="dxa" w:w="1000"/>
+            <w:shd w:fill="F3F7FC" w:color="auto" w:val="clear"/>
+          </w:tcPr>
+          <w:p>
+            <w:pPr>
+              <w:spacing w:after="60" w:line="300"/>
+              <w:jc w:val="left"/>
+            </w:pPr>
+            <w:r>
+              <w:rPr>
+                <w:rFonts w:ascii="Calibri" w:cs="Calibri" w:eastAsia="Calibri" w:hAnsi="Calibri"/>
+                <w:b w:val="false"/>
+                <w:bCs w:val="false"/>
+                <w:color w:val="10213F"/>
+                <w:sz w:val="20"/>
+                <w:szCs w:val="20"/>
+              </w:rPr>
+              <w:t xml:space="preserve">Aceptado</w:t>
+            </w:r>
+          </w:p>
+        </w:tc>
+      </w:tr>
+      <w:tr>
+        <w:tc>
+          <w:tcPr>
+            <w:tcW w:type="dxa" w:w="600"/>
+            <w:shd w:fill="FFFFFF" w:color="auto" w:val="clear"/>
+          </w:tcPr>
+          <w:p>
+            <w:pPr>
+              <w:spacing w:after="60" w:line="300"/>
+              <w:jc w:val="left"/>
+            </w:pPr>
+            <w:r>
+              <w:rPr>
+                <w:rFonts w:ascii="Calibri" w:cs="Calibri" w:eastAsia="Calibri" w:hAnsi="Calibri"/>
+                <w:b w:val="false"/>
+                <w:bCs w:val="false"/>
+                <w:color w:val="10213F"/>
+                <w:sz w:val="20"/>
+                <w:szCs w:val="20"/>
+              </w:rPr>
+              <w:t xml:space="preserve">CP-39</w:t>
+            </w:r>
+          </w:p>
+        </w:tc>
+        <w:tc>
+          <w:tcPr>
+            <w:tcW w:type="dxa" w:w="900"/>
+            <w:shd w:fill="FFFFFF" w:color="auto" w:val="clear"/>
+          </w:tcPr>
+          <w:p>
+            <w:pPr>
+              <w:spacing w:after="60" w:line="300"/>
+              <w:jc w:val="left"/>
+            </w:pPr>
+            <w:r>
+              <w:rPr>
+                <w:rFonts w:ascii="Calibri" w:cs="Calibri" w:eastAsia="Calibri" w:hAnsi="Calibri"/>
+                <w:b w:val="false"/>
+                <w:bCs w:val="false"/>
+                <w:color w:val="10213F"/>
+                <w:sz w:val="20"/>
+                <w:szCs w:val="20"/>
+              </w:rPr>
+              <w:t xml:space="preserve">RF-04 (topes)</w:t>
+            </w:r>
+          </w:p>
+        </w:tc>
+        <w:tc>
+          <w:tcPr>
+            <w:tcW w:type="dxa" w:w="900"/>
+            <w:shd w:fill="FFFFFF" w:color="auto" w:val="clear"/>
+          </w:tcPr>
+          <w:p>
+            <w:pPr>
+              <w:spacing w:after="60" w:line="300"/>
+              <w:jc w:val="left"/>
+            </w:pPr>
+            <w:r>
+              <w:rPr>
+                <w:rFonts w:ascii="Calibri" w:cs="Calibri" w:eastAsia="Calibri" w:hAnsi="Calibri"/>
+                <w:b w:val="false"/>
+                <w:bCs w:val="false"/>
+                <w:color w:val="10213F"/>
+                <w:sz w:val="20"/>
+                <w:szCs w:val="20"/>
+              </w:rPr>
+              <w:t xml:space="preserve">Válido (cancelación)</w:t>
+            </w:r>
+          </w:p>
+        </w:tc>
+        <w:tc>
+          <w:tcPr>
+            <w:tcW w:type="dxa" w:w="1200"/>
+            <w:shd w:fill="FFFFFF" w:color="auto" w:val="clear"/>
+          </w:tcPr>
+          <w:p>
+            <w:pPr>
+              <w:spacing w:after="60" w:line="300"/>
+              <w:jc w:val="left"/>
+            </w:pPr>
+            <w:r>
+              <w:rPr>
+                <w:rFonts w:ascii="Calibri" w:cs="Calibri" w:eastAsia="Calibri" w:hAnsi="Calibri"/>
+                <w:b w:val="false"/>
+                <w:bCs w:val="false"/>
+                <w:color w:val="10213F"/>
+                <w:sz w:val="20"/>
+                <w:szCs w:val="20"/>
+              </w:rPr>
+              <w:t xml:space="preserve">Confirmación de destinatario en pantalla</w:t>
+            </w:r>
+          </w:p>
+        </w:tc>
+        <w:tc>
+          <w:tcPr>
+            <w:tcW w:type="dxa" w:w="1200"/>
+            <w:shd w:fill="FFFFFF" w:color="auto" w:val="clear"/>
+          </w:tcPr>
+          <w:p>
+            <w:pPr>
+              <w:spacing w:after="60" w:line="300"/>
+              <w:jc w:val="left"/>
+            </w:pPr>
+            <w:r>
+              <w:rPr>
+                <w:rFonts w:ascii="Calibri" w:cs="Calibri" w:eastAsia="Calibri" w:hAnsi="Calibri"/>
+                <w:b w:val="false"/>
+                <w:bCs w:val="false"/>
+                <w:color w:val="10213F"/>
+                <w:sz w:val="20"/>
+                <w:szCs w:val="20"/>
+              </w:rPr>
+              <w:t xml:space="preserve">Cuenta 009-441-220, monto $100.000</w:t>
+            </w:r>
+          </w:p>
+        </w:tc>
+        <w:tc>
+          <w:tcPr>
+            <w:tcW w:type="dxa" w:w="1400"/>
+            <w:shd w:fill="FFFFFF" w:color="auto" w:val="clear"/>
+          </w:tcPr>
+          <w:p>
+            <w:pPr>
+              <w:spacing w:after="60" w:line="300"/>
+              <w:jc w:val="left"/>
+            </w:pPr>
+            <w:r>
+              <w:rPr>
+                <w:rFonts w:ascii="Calibri" w:cs="Calibri" w:eastAsia="Calibri" w:hAnsi="Calibri"/>
+                <w:b w:val="false"/>
+                <w:bCs w:val="false"/>
+                <w:color w:val="10213F"/>
+                <w:sz w:val="20"/>
+                <w:szCs w:val="20"/>
+              </w:rPr>
+              <w:t xml:space="preserve">1. Transferir para abrir la confirmación. 2. Cancelar la confirmación</w:t>
+            </w:r>
+          </w:p>
+        </w:tc>
+        <w:tc>
+          <w:tcPr>
+            <w:tcW w:type="dxa" w:w="2200"/>
+            <w:shd w:fill="FFFFFF" w:color="auto" w:val="clear"/>
+          </w:tcPr>
+          <w:p>
+            <w:pPr>
+              <w:spacing w:after="60" w:line="300"/>
+              <w:jc w:val="left"/>
+            </w:pPr>
+            <w:r>
+              <w:rPr>
+                <w:rFonts w:ascii="Calibri" w:cs="Calibri" w:eastAsia="Calibri" w:hAnsi="Calibri"/>
+                <w:b w:val="false"/>
+                <w:bCs w:val="false"/>
+                <w:color w:val="10213F"/>
+                <w:sz w:val="20"/>
+                <w:szCs w:val="20"/>
+              </w:rPr>
+              <w:t xml:space="preserve">El panel de confirmación queda vacío; disponible de María sin cambio y ningún movimiento registrado.</w:t>
+            </w:r>
+          </w:p>
+        </w:tc>
+        <w:tc>
+          <w:tcPr>
+            <w:tcW w:type="dxa" w:w="800"/>
+            <w:shd w:fill="FFFFFF" w:color="auto" w:val="clear"/>
+          </w:tcPr>
+          <w:p>
+            <w:pPr>
+              <w:spacing w:after="60" w:line="300"/>
+              <w:jc w:val="left"/>
+            </w:pPr>
+            <w:r>
+              <w:rPr>
+                <w:rFonts w:ascii="Calibri" w:cs="Calibri" w:eastAsia="Calibri" w:hAnsi="Calibri"/>
+                <w:b w:val="false"/>
+                <w:bCs w:val="false"/>
+                <w:color w:val="10213F"/>
+                <w:sz w:val="20"/>
+                <w:szCs w:val="20"/>
+              </w:rPr>
+              <w:t xml:space="preserve">RF-04 (topes)</w:t>
+            </w:r>
+          </w:p>
+        </w:tc>
+        <w:tc>
+          <w:tcPr>
+            <w:tcW w:type="dxa" w:w="1000"/>
+            <w:shd w:fill="FFFFFF" w:color="auto" w:val="clear"/>
+          </w:tcPr>
+          <w:p>
+            <w:pPr>
+              <w:spacing w:after="60" w:line="300"/>
+              <w:jc w:val="left"/>
+            </w:pPr>
+            <w:r>
+              <w:rPr>
+                <w:rFonts w:ascii="Calibri" w:cs="Calibri" w:eastAsia="Calibri" w:hAnsi="Calibri"/>
+                <w:b w:val="false"/>
+                <w:bCs w:val="false"/>
+                <w:color w:val="10213F"/>
+                <w:sz w:val="20"/>
+                <w:szCs w:val="20"/>
+              </w:rPr>
+              <w:t xml:space="preserve">Aceptado</w:t>
+            </w:r>
+          </w:p>
+        </w:tc>
+      </w:tr>
+      <w:tr>
+        <w:tc>
+          <w:tcPr>
+            <w:tcW w:type="dxa" w:w="600"/>
+            <w:shd w:fill="F3F7FC" w:color="auto" w:val="clear"/>
+          </w:tcPr>
+          <w:p>
+            <w:pPr>
+              <w:spacing w:after="60" w:line="300"/>
+              <w:jc w:val="left"/>
+            </w:pPr>
+            <w:r>
+              <w:rPr>
+                <w:rFonts w:ascii="Calibri" w:cs="Calibri" w:eastAsia="Calibri" w:hAnsi="Calibri"/>
+                <w:b w:val="false"/>
+                <w:bCs w:val="false"/>
+                <w:color w:val="10213F"/>
+                <w:sz w:val="20"/>
+                <w:szCs w:val="20"/>
+              </w:rPr>
+              <w:t xml:space="preserve">CP-40</w:t>
+            </w:r>
+          </w:p>
+        </w:tc>
+        <w:tc>
+          <w:tcPr>
+            <w:tcW w:type="dxa" w:w="900"/>
+            <w:shd w:fill="F3F7FC" w:color="auto" w:val="clear"/>
+          </w:tcPr>
+          <w:p>
+            <w:pPr>
+              <w:spacing w:after="60" w:line="300"/>
+              <w:jc w:val="left"/>
+            </w:pPr>
+            <w:r>
+              <w:rPr>
+                <w:rFonts w:ascii="Calibri" w:cs="Calibri" w:eastAsia="Calibri" w:hAnsi="Calibri"/>
+                <w:b w:val="false"/>
+                <w:bCs w:val="false"/>
+                <w:color w:val="10213F"/>
+                <w:sz w:val="20"/>
+                <w:szCs w:val="20"/>
+              </w:rPr>
+              <w:t xml:space="preserve">RF-04 (topes)</w:t>
+            </w:r>
+          </w:p>
+        </w:tc>
+        <w:tc>
+          <w:tcPr>
+            <w:tcW w:type="dxa" w:w="900"/>
+            <w:shd w:fill="F3F7FC" w:color="auto" w:val="clear"/>
+          </w:tcPr>
+          <w:p>
+            <w:pPr>
+              <w:spacing w:after="60" w:line="300"/>
+              <w:jc w:val="left"/>
+            </w:pPr>
+            <w:r>
+              <w:rPr>
+                <w:rFonts w:ascii="Calibri" w:cs="Calibri" w:eastAsia="Calibri" w:hAnsi="Calibri"/>
+                <w:b w:val="false"/>
+                <w:bCs w:val="false"/>
+                <w:color w:val="10213F"/>
+                <w:sz w:val="20"/>
+                <w:szCs w:val="20"/>
+              </w:rPr>
+              <w:t xml:space="preserve">Inválido (cuenta propia)</w:t>
+            </w:r>
+          </w:p>
+        </w:tc>
+        <w:tc>
+          <w:tcPr>
+            <w:tcW w:type="dxa" w:w="1200"/>
+            <w:shd w:fill="F3F7FC" w:color="auto" w:val="clear"/>
+          </w:tcPr>
+          <w:p>
+            <w:pPr>
+              <w:spacing w:after="60" w:line="300"/>
+              <w:jc w:val="left"/>
+            </w:pPr>
+            <w:r>
+              <w:rPr>
+                <w:rFonts w:ascii="Calibri" w:cs="Calibri" w:eastAsia="Calibri" w:hAnsi="Calibri"/>
+                <w:b w:val="false"/>
+                <w:bCs w:val="false"/>
+                <w:color w:val="10213F"/>
+                <w:sz w:val="20"/>
+                <w:szCs w:val="20"/>
+              </w:rPr>
+              <w:t xml:space="preserve">María autenticada</w:t>
+            </w:r>
+          </w:p>
+        </w:tc>
+        <w:tc>
+          <w:tcPr>
+            <w:tcW w:type="dxa" w:w="1200"/>
+            <w:shd w:fill="F3F7FC" w:color="auto" w:val="clear"/>
+          </w:tcPr>
+          <w:p>
+            <w:pPr>
+              <w:spacing w:after="60" w:line="300"/>
+              <w:jc w:val="left"/>
+            </w:pPr>
+            <w:r>
+              <w:rPr>
+                <w:rFonts w:ascii="Calibri" w:cs="Calibri" w:eastAsia="Calibri" w:hAnsi="Calibri"/>
+                <w:b w:val="false"/>
+                <w:bCs w:val="false"/>
+                <w:color w:val="10213F"/>
+                <w:sz w:val="20"/>
+                <w:szCs w:val="20"/>
+              </w:rPr>
+              <w:t xml:space="preserve">Cuenta destino 001-234-567 (la suya), monto $50.000</w:t>
+            </w:r>
+          </w:p>
+        </w:tc>
+        <w:tc>
+          <w:tcPr>
+            <w:tcW w:type="dxa" w:w="1400"/>
+            <w:shd w:fill="F3F7FC" w:color="auto" w:val="clear"/>
+          </w:tcPr>
+          <w:p>
+            <w:pPr>
+              <w:spacing w:after="60" w:line="300"/>
+              <w:jc w:val="left"/>
+            </w:pPr>
+            <w:r>
+              <w:rPr>
+                <w:rFonts w:ascii="Calibri" w:cs="Calibri" w:eastAsia="Calibri" w:hAnsi="Calibri"/>
+                <w:b w:val="false"/>
+                <w:bCs w:val="false"/>
+                <w:color w:val="10213F"/>
+                <w:sz w:val="20"/>
+                <w:szCs w:val="20"/>
+              </w:rPr>
+              <w:t xml:space="preserve">1. Escribir su propia cuenta como destino. 2. Transferir</w:t>
+            </w:r>
+          </w:p>
+        </w:tc>
+        <w:tc>
+          <w:tcPr>
+            <w:tcW w:type="dxa" w:w="2200"/>
+            <w:shd w:fill="F3F7FC" w:color="auto" w:val="clear"/>
+          </w:tcPr>
+          <w:p>
+            <w:pPr>
+              <w:spacing w:after="60" w:line="300"/>
+              <w:jc w:val="left"/>
+            </w:pPr>
+            <w:r>
+              <w:rPr>
+                <w:rFonts w:ascii="Calibri" w:cs="Calibri" w:eastAsia="Calibri" w:hAnsi="Calibri"/>
+                <w:b w:val="false"/>
+                <w:bCs w:val="false"/>
+                <w:color w:val="10213F"/>
+                <w:sz w:val="20"/>
+                <w:szCs w:val="20"/>
+              </w:rPr>
+              <w:t xml:space="preserve">Mensaje de error sobre la "propia cuenta"; sin movimiento registrado.</w:t>
+            </w:r>
+          </w:p>
+        </w:tc>
+        <w:tc>
+          <w:tcPr>
+            <w:tcW w:type="dxa" w:w="800"/>
+            <w:shd w:fill="F3F7FC" w:color="auto" w:val="clear"/>
+          </w:tcPr>
+          <w:p>
+            <w:pPr>
+              <w:spacing w:after="60" w:line="300"/>
+              <w:jc w:val="left"/>
+            </w:pPr>
+            <w:r>
+              <w:rPr>
+                <w:rFonts w:ascii="Calibri" w:cs="Calibri" w:eastAsia="Calibri" w:hAnsi="Calibri"/>
+                <w:b w:val="false"/>
+                <w:bCs w:val="false"/>
+                <w:color w:val="10213F"/>
+                <w:sz w:val="20"/>
+                <w:szCs w:val="20"/>
+              </w:rPr>
+              <w:t xml:space="preserve">RF-04 (topes)</w:t>
+            </w:r>
+          </w:p>
+        </w:tc>
+        <w:tc>
+          <w:tcPr>
+            <w:tcW w:type="dxa" w:w="1000"/>
+            <w:shd w:fill="F3F7FC" w:color="auto" w:val="clear"/>
+          </w:tcPr>
+          <w:p>
+            <w:pPr>
+              <w:spacing w:after="60" w:line="300"/>
+              <w:jc w:val="left"/>
+            </w:pPr>
+            <w:r>
+              <w:rPr>
+                <w:rFonts w:ascii="Calibri" w:cs="Calibri" w:eastAsia="Calibri" w:hAnsi="Calibri"/>
+                <w:b w:val="false"/>
+                <w:bCs w:val="false"/>
+                <w:color w:val="10213F"/>
+                <w:sz w:val="20"/>
+                <w:szCs w:val="20"/>
+              </w:rPr>
+              <w:t xml:space="preserve">Aceptado</w:t>
+            </w:r>
+          </w:p>
+        </w:tc>
+      </w:tr>
+      <w:tr>
+        <w:tc>
+          <w:tcPr>
+            <w:tcW w:type="dxa" w:w="600"/>
+            <w:shd w:fill="FFFFFF" w:color="auto" w:val="clear"/>
+          </w:tcPr>
+          <w:p>
+            <w:pPr>
+              <w:spacing w:after="60" w:line="300"/>
+              <w:jc w:val="left"/>
+            </w:pPr>
+            <w:r>
+              <w:rPr>
+                <w:rFonts w:ascii="Calibri" w:cs="Calibri" w:eastAsia="Calibri" w:hAnsi="Calibri"/>
+                <w:b w:val="false"/>
+                <w:bCs w:val="false"/>
+                <w:color w:val="10213F"/>
+                <w:sz w:val="20"/>
+                <w:szCs w:val="20"/>
+              </w:rPr>
+              <w:t xml:space="preserve">CP-41</w:t>
+            </w:r>
+          </w:p>
+        </w:tc>
+        <w:tc>
+          <w:tcPr>
+            <w:tcW w:type="dxa" w:w="900"/>
+            <w:shd w:fill="FFFFFF" w:color="auto" w:val="clear"/>
+          </w:tcPr>
+          <w:p>
+            <w:pPr>
+              <w:spacing w:after="60" w:line="300"/>
+              <w:jc w:val="left"/>
+            </w:pPr>
+            <w:r>
+              <w:rPr>
+                <w:rFonts w:ascii="Calibri" w:cs="Calibri" w:eastAsia="Calibri" w:hAnsi="Calibri"/>
+                <w:b w:val="false"/>
+                <w:bCs w:val="false"/>
+                <w:color w:val="10213F"/>
+                <w:sz w:val="20"/>
+                <w:szCs w:val="20"/>
+              </w:rPr>
+              <w:t xml:space="preserve">RF-04 (topes) / RN-01</w:t>
+            </w:r>
+          </w:p>
+        </w:tc>
+        <w:tc>
+          <w:tcPr>
+            <w:tcW w:type="dxa" w:w="900"/>
+            <w:shd w:fill="FFFFFF" w:color="auto" w:val="clear"/>
+          </w:tcPr>
+          <w:p>
+            <w:pPr>
+              <w:spacing w:after="60" w:line="300"/>
+              <w:jc w:val="left"/>
+            </w:pPr>
+            <w:r>
+              <w:rPr>
+                <w:rFonts w:ascii="Calibri" w:cs="Calibri" w:eastAsia="Calibri" w:hAnsi="Calibri"/>
+                <w:b w:val="false"/>
+                <w:bCs w:val="false"/>
+                <w:color w:val="10213F"/>
+                <w:sz w:val="20"/>
+                <w:szCs w:val="20"/>
+              </w:rPr>
+              <w:t xml:space="preserve">Inválido (tope diario)</w:t>
+            </w:r>
+          </w:p>
+        </w:tc>
+        <w:tc>
+          <w:tcPr>
+            <w:tcW w:type="dxa" w:w="1200"/>
+            <w:shd w:fill="FFFFFF" w:color="auto" w:val="clear"/>
+          </w:tcPr>
+          <w:p>
+            <w:pPr>
+              <w:spacing w:after="60" w:line="300"/>
+              <w:jc w:val="left"/>
+            </w:pPr>
+            <w:r>
+              <w:rPr>
+                <w:rFonts w:ascii="Calibri" w:cs="Calibri" w:eastAsia="Calibri" w:hAnsi="Calibri"/>
+                <w:b w:val="false"/>
+                <w:bCs w:val="false"/>
+                <w:color w:val="10213F"/>
+                <w:sz w:val="20"/>
+                <w:szCs w:val="20"/>
+              </w:rPr>
+              <w:t xml:space="preserve">María con tope diario $50.000 y mensual $1.000.000 guardados</w:t>
+            </w:r>
+          </w:p>
+        </w:tc>
+        <w:tc>
+          <w:tcPr>
+            <w:tcW w:type="dxa" w:w="1200"/>
+            <w:shd w:fill="FFFFFF" w:color="auto" w:val="clear"/>
+          </w:tcPr>
+          <w:p>
+            <w:pPr>
+              <w:spacing w:after="60" w:line="300"/>
+              <w:jc w:val="left"/>
+            </w:pPr>
+            <w:r>
+              <w:rPr>
+                <w:rFonts w:ascii="Calibri" w:cs="Calibri" w:eastAsia="Calibri" w:hAnsi="Calibri"/>
+                <w:b w:val="false"/>
+                <w:bCs w:val="false"/>
+                <w:color w:val="10213F"/>
+                <w:sz w:val="20"/>
+                <w:szCs w:val="20"/>
+              </w:rPr>
+              <w:t xml:space="preserve">Cuenta 009-441-220, monto $60.000</w:t>
+            </w:r>
+          </w:p>
+        </w:tc>
+        <w:tc>
+          <w:tcPr>
+            <w:tcW w:type="dxa" w:w="1400"/>
+            <w:shd w:fill="FFFFFF" w:color="auto" w:val="clear"/>
+          </w:tcPr>
+          <w:p>
+            <w:pPr>
+              <w:spacing w:after="60" w:line="300"/>
+              <w:jc w:val="left"/>
+            </w:pPr>
+            <w:r>
+              <w:rPr>
+                <w:rFonts w:ascii="Calibri" w:cs="Calibri" w:eastAsia="Calibri" w:hAnsi="Calibri"/>
+                <w:b w:val="false"/>
+                <w:bCs w:val="false"/>
+                <w:color w:val="10213F"/>
+                <w:sz w:val="20"/>
+                <w:szCs w:val="20"/>
+              </w:rPr>
+              <w:t xml:space="preserve">1. Ir a Notificaciones. 2. Guardar topes 50.000 / 1.000.000. 3. Transferir $60.000</w:t>
+            </w:r>
+          </w:p>
+        </w:tc>
+        <w:tc>
+          <w:tcPr>
+            <w:tcW w:type="dxa" w:w="2200"/>
+            <w:shd w:fill="FFFFFF" w:color="auto" w:val="clear"/>
+          </w:tcPr>
+          <w:p>
+            <w:pPr>
+              <w:spacing w:after="60" w:line="300"/>
+              <w:jc w:val="left"/>
+            </w:pPr>
+            <w:r>
+              <w:rPr>
+                <w:rFonts w:ascii="Calibri" w:cs="Calibri" w:eastAsia="Calibri" w:hAnsi="Calibri"/>
+                <w:b w:val="false"/>
+                <w:bCs w:val="false"/>
+                <w:color w:val="10213F"/>
+                <w:sz w:val="20"/>
+                <w:szCs w:val="20"/>
+              </w:rPr>
+              <w:t xml:space="preserve">Mensaje "tope diario"; movimiento registrado con estado Rechazada y motivo de tope diario; disponible María = $2.450.000.</w:t>
+            </w:r>
+          </w:p>
+        </w:tc>
+        <w:tc>
+          <w:tcPr>
+            <w:tcW w:type="dxa" w:w="800"/>
+            <w:shd w:fill="FFFFFF" w:color="auto" w:val="clear"/>
+          </w:tcPr>
+          <w:p>
+            <w:pPr>
+              <w:spacing w:after="60" w:line="300"/>
+              <w:jc w:val="left"/>
+            </w:pPr>
+            <w:r>
+              <w:rPr>
+                <w:rFonts w:ascii="Calibri" w:cs="Calibri" w:eastAsia="Calibri" w:hAnsi="Calibri"/>
+                <w:b w:val="false"/>
+                <w:bCs w:val="false"/>
+                <w:color w:val="10213F"/>
+                <w:sz w:val="20"/>
+                <w:szCs w:val="20"/>
+              </w:rPr>
+              <w:t xml:space="preserve">RF-04 (topes)</w:t>
+            </w:r>
+          </w:p>
+        </w:tc>
+        <w:tc>
+          <w:tcPr>
+            <w:tcW w:type="dxa" w:w="1000"/>
+            <w:shd w:fill="FFFFFF" w:color="auto" w:val="clear"/>
+          </w:tcPr>
+          <w:p>
+            <w:pPr>
+              <w:spacing w:after="60" w:line="300"/>
+              <w:jc w:val="left"/>
+            </w:pPr>
+            <w:r>
+              <w:rPr>
+                <w:rFonts w:ascii="Calibri" w:cs="Calibri" w:eastAsia="Calibri" w:hAnsi="Calibri"/>
+                <w:b w:val="false"/>
+                <w:bCs w:val="false"/>
+                <w:color w:val="10213F"/>
+                <w:sz w:val="20"/>
+                <w:szCs w:val="20"/>
+              </w:rPr>
+              <w:t xml:space="preserve">Aceptado</w:t>
+            </w:r>
+          </w:p>
+        </w:tc>
+      </w:tr>
+      <w:tr>
+        <w:tc>
+          <w:tcPr>
+            <w:tcW w:type="dxa" w:w="600"/>
+            <w:shd w:fill="F3F7FC" w:color="auto" w:val="clear"/>
+          </w:tcPr>
+          <w:p>
+            <w:pPr>
+              <w:spacing w:after="60" w:line="300"/>
+              <w:jc w:val="left"/>
+            </w:pPr>
+            <w:r>
+              <w:rPr>
+                <w:rFonts w:ascii="Calibri" w:cs="Calibri" w:eastAsia="Calibri" w:hAnsi="Calibri"/>
+                <w:b w:val="false"/>
+                <w:bCs w:val="false"/>
+                <w:color w:val="10213F"/>
+                <w:sz w:val="20"/>
+                <w:szCs w:val="20"/>
+              </w:rPr>
+              <w:t xml:space="preserve">CP-42</w:t>
+            </w:r>
+          </w:p>
+        </w:tc>
+        <w:tc>
+          <w:tcPr>
+            <w:tcW w:type="dxa" w:w="900"/>
+            <w:shd w:fill="F3F7FC" w:color="auto" w:val="clear"/>
+          </w:tcPr>
+          <w:p>
+            <w:pPr>
+              <w:spacing w:after="60" w:line="300"/>
+              <w:jc w:val="left"/>
+            </w:pPr>
+            <w:r>
+              <w:rPr>
+                <w:rFonts w:ascii="Calibri" w:cs="Calibri" w:eastAsia="Calibri" w:hAnsi="Calibri"/>
+                <w:b w:val="false"/>
+                <w:bCs w:val="false"/>
+                <w:color w:val="10213F"/>
+                <w:sz w:val="20"/>
+                <w:szCs w:val="20"/>
+              </w:rPr>
+              <w:t xml:space="preserve">RF-04 (topes)</w:t>
+            </w:r>
+          </w:p>
+        </w:tc>
+        <w:tc>
+          <w:tcPr>
+            <w:tcW w:type="dxa" w:w="900"/>
+            <w:shd w:fill="F3F7FC" w:color="auto" w:val="clear"/>
+          </w:tcPr>
+          <w:p>
+            <w:pPr>
+              <w:spacing w:after="60" w:line="300"/>
+              <w:jc w:val="left"/>
+            </w:pPr>
+            <w:r>
+              <w:rPr>
+                <w:rFonts w:ascii="Calibri" w:cs="Calibri" w:eastAsia="Calibri" w:hAnsi="Calibri"/>
+                <w:b w:val="false"/>
+                <w:bCs w:val="false"/>
+                <w:color w:val="10213F"/>
+                <w:sz w:val="20"/>
+                <w:szCs w:val="20"/>
+              </w:rPr>
+              <w:t xml:space="preserve">Válido (consumo de cupo)</w:t>
+            </w:r>
+          </w:p>
+        </w:tc>
+        <w:tc>
+          <w:tcPr>
+            <w:tcW w:type="dxa" w:w="1200"/>
+            <w:shd w:fill="F3F7FC" w:color="auto" w:val="clear"/>
+          </w:tcPr>
+          <w:p>
+            <w:pPr>
+              <w:spacing w:after="60" w:line="300"/>
+              <w:jc w:val="left"/>
+            </w:pPr>
+            <w:r>
+              <w:rPr>
+                <w:rFonts w:ascii="Calibri" w:cs="Calibri" w:eastAsia="Calibri" w:hAnsi="Calibri"/>
+                <w:b w:val="false"/>
+                <w:bCs w:val="false"/>
+                <w:color w:val="10213F"/>
+                <w:sz w:val="20"/>
+                <w:szCs w:val="20"/>
+              </w:rPr>
+              <w:t xml:space="preserve">María con tope diario $150.000 y mensual $1.000.000</w:t>
+            </w:r>
+          </w:p>
+        </w:tc>
+        <w:tc>
+          <w:tcPr>
+            <w:tcW w:type="dxa" w:w="1200"/>
+            <w:shd w:fill="F3F7FC" w:color="auto" w:val="clear"/>
+          </w:tcPr>
+          <w:p>
+            <w:pPr>
+              <w:spacing w:after="60" w:line="300"/>
+              <w:jc w:val="left"/>
+            </w:pPr>
+            <w:r>
+              <w:rPr>
+                <w:rFonts w:ascii="Calibri" w:cs="Calibri" w:eastAsia="Calibri" w:hAnsi="Calibri"/>
+                <w:b w:val="false"/>
+                <w:bCs w:val="false"/>
+                <w:color w:val="10213F"/>
+                <w:sz w:val="20"/>
+                <w:szCs w:val="20"/>
+              </w:rPr>
+              <w:t xml:space="preserve">Envío de $100.000 y luego intento de $60.000</w:t>
+            </w:r>
+          </w:p>
+        </w:tc>
+        <w:tc>
+          <w:tcPr>
+            <w:tcW w:type="dxa" w:w="1400"/>
+            <w:shd w:fill="F3F7FC" w:color="auto" w:val="clear"/>
+          </w:tcPr>
+          <w:p>
+            <w:pPr>
+              <w:spacing w:after="60" w:line="300"/>
+              <w:jc w:val="left"/>
+            </w:pPr>
+            <w:r>
+              <w:rPr>
+                <w:rFonts w:ascii="Calibri" w:cs="Calibri" w:eastAsia="Calibri" w:hAnsi="Calibri"/>
+                <w:b w:val="false"/>
+                <w:bCs w:val="false"/>
+                <w:color w:val="10213F"/>
+                <w:sz w:val="20"/>
+                <w:szCs w:val="20"/>
+              </w:rPr>
+              <w:t xml:space="preserve">1. Guardar topes 150.000 / 1.000.000. 2. Enviar $100.000. 3. Intentar enviar $60.000</w:t>
+            </w:r>
+          </w:p>
+        </w:tc>
+        <w:tc>
+          <w:tcPr>
+            <w:tcW w:type="dxa" w:w="2200"/>
+            <w:shd w:fill="F3F7FC" w:color="auto" w:val="clear"/>
+          </w:tcPr>
+          <w:p>
+            <w:pPr>
+              <w:spacing w:after="60" w:line="300"/>
+              <w:jc w:val="left"/>
+            </w:pPr>
+            <w:r>
+              <w:rPr>
+                <w:rFonts w:ascii="Calibri" w:cs="Calibri" w:eastAsia="Calibri" w:hAnsi="Calibri"/>
+                <w:b w:val="false"/>
+                <w:bCs w:val="false"/>
+                <w:color w:val="10213F"/>
+                <w:sz w:val="20"/>
+                <w:szCs w:val="20"/>
+              </w:rPr>
+              <w:t xml:space="preserve">Cupo diario inicial $150.000; tras el envío queda $50.000; el segundo envío se rechaza con mensaje "tope diario".</w:t>
+            </w:r>
+          </w:p>
+        </w:tc>
+        <w:tc>
+          <w:tcPr>
+            <w:tcW w:type="dxa" w:w="800"/>
+            <w:shd w:fill="F3F7FC" w:color="auto" w:val="clear"/>
+          </w:tcPr>
+          <w:p>
+            <w:pPr>
+              <w:spacing w:after="60" w:line="300"/>
+              <w:jc w:val="left"/>
+            </w:pPr>
+            <w:r>
+              <w:rPr>
+                <w:rFonts w:ascii="Calibri" w:cs="Calibri" w:eastAsia="Calibri" w:hAnsi="Calibri"/>
+                <w:b w:val="false"/>
+                <w:bCs w:val="false"/>
+                <w:color w:val="10213F"/>
+                <w:sz w:val="20"/>
+                <w:szCs w:val="20"/>
+              </w:rPr>
+              <w:t xml:space="preserve">RF-04 (topes)</w:t>
+            </w:r>
+          </w:p>
+        </w:tc>
+        <w:tc>
+          <w:tcPr>
+            <w:tcW w:type="dxa" w:w="1000"/>
+            <w:shd w:fill="F3F7FC" w:color="auto" w:val="clear"/>
+          </w:tcPr>
+          <w:p>
+            <w:pPr>
+              <w:spacing w:after="60" w:line="300"/>
+              <w:jc w:val="left"/>
+            </w:pPr>
+            <w:r>
+              <w:rPr>
+                <w:rFonts w:ascii="Calibri" w:cs="Calibri" w:eastAsia="Calibri" w:hAnsi="Calibri"/>
+                <w:b w:val="false"/>
+                <w:bCs w:val="false"/>
+                <w:color w:val="10213F"/>
+                <w:sz w:val="20"/>
+                <w:szCs w:val="20"/>
+              </w:rPr>
+              <w:t xml:space="preserve">Aceptado</w:t>
+            </w:r>
+          </w:p>
+        </w:tc>
+      </w:tr>
+      <w:tr>
+        <w:tc>
+          <w:tcPr>
+            <w:tcW w:type="dxa" w:w="600"/>
+            <w:shd w:fill="FFFFFF" w:color="auto" w:val="clear"/>
+          </w:tcPr>
+          <w:p>
+            <w:pPr>
+              <w:spacing w:after="60" w:line="300"/>
+              <w:jc w:val="left"/>
+            </w:pPr>
+            <w:r>
+              <w:rPr>
+                <w:rFonts w:ascii="Calibri" w:cs="Calibri" w:eastAsia="Calibri" w:hAnsi="Calibri"/>
+                <w:b w:val="false"/>
+                <w:bCs w:val="false"/>
+                <w:color w:val="10213F"/>
+                <w:sz w:val="20"/>
+                <w:szCs w:val="20"/>
+              </w:rPr>
+              <w:t xml:space="preserve">CP-43</w:t>
+            </w:r>
+          </w:p>
+        </w:tc>
+        <w:tc>
+          <w:tcPr>
+            <w:tcW w:type="dxa" w:w="900"/>
+            <w:shd w:fill="FFFFFF" w:color="auto" w:val="clear"/>
+          </w:tcPr>
+          <w:p>
+            <w:pPr>
+              <w:spacing w:after="60" w:line="300"/>
+              <w:jc w:val="left"/>
+            </w:pPr>
+            <w:r>
+              <w:rPr>
+                <w:rFonts w:ascii="Calibri" w:cs="Calibri" w:eastAsia="Calibri" w:hAnsi="Calibri"/>
+                <w:b w:val="false"/>
+                <w:bCs w:val="false"/>
+                <w:color w:val="10213F"/>
+                <w:sz w:val="20"/>
+                <w:szCs w:val="20"/>
+              </w:rPr>
+              <w:t xml:space="preserve">RF-04 (topes)</w:t>
+            </w:r>
+          </w:p>
+        </w:tc>
+        <w:tc>
+          <w:tcPr>
+            <w:tcW w:type="dxa" w:w="900"/>
+            <w:shd w:fill="FFFFFF" w:color="auto" w:val="clear"/>
+          </w:tcPr>
+          <w:p>
+            <w:pPr>
+              <w:spacing w:after="60" w:line="300"/>
+              <w:jc w:val="left"/>
+            </w:pPr>
+            <w:r>
+              <w:rPr>
+                <w:rFonts w:ascii="Calibri" w:cs="Calibri" w:eastAsia="Calibri" w:hAnsi="Calibri"/>
+                <w:b w:val="false"/>
+                <w:bCs w:val="false"/>
+                <w:color w:val="10213F"/>
+                <w:sz w:val="20"/>
+                <w:szCs w:val="20"/>
+              </w:rPr>
+              <w:t xml:space="preserve">Inválido (tope incoherente)</w:t>
+            </w:r>
+          </w:p>
+        </w:tc>
+        <w:tc>
+          <w:tcPr>
+            <w:tcW w:type="dxa" w:w="1200"/>
+            <w:shd w:fill="FFFFFF" w:color="auto" w:val="clear"/>
+          </w:tcPr>
+          <w:p>
+            <w:pPr>
+              <w:spacing w:after="60" w:line="300"/>
+              <w:jc w:val="left"/>
+            </w:pPr>
+            <w:r>
+              <w:rPr>
+                <w:rFonts w:ascii="Calibri" w:cs="Calibri" w:eastAsia="Calibri" w:hAnsi="Calibri"/>
+                <w:b w:val="false"/>
+                <w:bCs w:val="false"/>
+                <w:color w:val="10213F"/>
+                <w:sz w:val="20"/>
+                <w:szCs w:val="20"/>
+              </w:rPr>
+              <w:t xml:space="preserve">María autenticada</w:t>
+            </w:r>
+          </w:p>
+        </w:tc>
+        <w:tc>
+          <w:tcPr>
+            <w:tcW w:type="dxa" w:w="1200"/>
+            <w:shd w:fill="FFFFFF" w:color="auto" w:val="clear"/>
+          </w:tcPr>
+          <w:p>
+            <w:pPr>
+              <w:spacing w:after="60" w:line="300"/>
+              <w:jc w:val="left"/>
+            </w:pPr>
+            <w:r>
+              <w:rPr>
+                <w:rFonts w:ascii="Calibri" w:cs="Calibri" w:eastAsia="Calibri" w:hAnsi="Calibri"/>
+                <w:b w:val="false"/>
+                <w:bCs w:val="false"/>
+                <w:color w:val="10213F"/>
+                <w:sz w:val="20"/>
+                <w:szCs w:val="20"/>
+              </w:rPr>
+              <w:t xml:space="preserve">Tope diario $900.000, tope mensual $500.000</w:t>
+            </w:r>
+          </w:p>
+        </w:tc>
+        <w:tc>
+          <w:tcPr>
+            <w:tcW w:type="dxa" w:w="1400"/>
+            <w:shd w:fill="FFFFFF" w:color="auto" w:val="clear"/>
+          </w:tcPr>
+          <w:p>
+            <w:pPr>
+              <w:spacing w:after="60" w:line="300"/>
+              <w:jc w:val="left"/>
+            </w:pPr>
+            <w:r>
+              <w:rPr>
+                <w:rFonts w:ascii="Calibri" w:cs="Calibri" w:eastAsia="Calibri" w:hAnsi="Calibri"/>
+                <w:b w:val="false"/>
+                <w:bCs w:val="false"/>
+                <w:color w:val="10213F"/>
+                <w:sz w:val="20"/>
+                <w:szCs w:val="20"/>
+              </w:rPr>
+              <w:t xml:space="preserve">En Notificaciones: guardar topes</w:t>
+            </w:r>
+          </w:p>
+        </w:tc>
+        <w:tc>
+          <w:tcPr>
+            <w:tcW w:type="dxa" w:w="2200"/>
+            <w:shd w:fill="FFFFFF" w:color="auto" w:val="clear"/>
+          </w:tcPr>
+          <w:p>
+            <w:pPr>
+              <w:spacing w:after="60" w:line="300"/>
+              <w:jc w:val="left"/>
+            </w:pPr>
+            <w:r>
+              <w:rPr>
+                <w:rFonts w:ascii="Calibri" w:cs="Calibri" w:eastAsia="Calibri" w:hAnsi="Calibri"/>
+                <w:b w:val="false"/>
+                <w:bCs w:val="false"/>
+                <w:color w:val="10213F"/>
+                <w:sz w:val="20"/>
+                <w:szCs w:val="20"/>
+              </w:rPr>
+              <w:t xml:space="preserve">Mensaje "el tope diario no puede superar al mensual"; el tope diario conserva el valor por defecto.</w:t>
+            </w:r>
+          </w:p>
+        </w:tc>
+        <w:tc>
+          <w:tcPr>
+            <w:tcW w:type="dxa" w:w="800"/>
+            <w:shd w:fill="FFFFFF" w:color="auto" w:val="clear"/>
+          </w:tcPr>
+          <w:p>
+            <w:pPr>
+              <w:spacing w:after="60" w:line="300"/>
+              <w:jc w:val="left"/>
+            </w:pPr>
+            <w:r>
+              <w:rPr>
+                <w:rFonts w:ascii="Calibri" w:cs="Calibri" w:eastAsia="Calibri" w:hAnsi="Calibri"/>
+                <w:b w:val="false"/>
+                <w:bCs w:val="false"/>
+                <w:color w:val="10213F"/>
+                <w:sz w:val="20"/>
+                <w:szCs w:val="20"/>
+              </w:rPr>
+              <w:t xml:space="preserve">RF-04 (topes)</w:t>
+            </w:r>
+          </w:p>
+        </w:tc>
+        <w:tc>
+          <w:tcPr>
+            <w:tcW w:type="dxa" w:w="1000"/>
+            <w:shd w:fill="FFFFFF" w:color="auto" w:val="clear"/>
+          </w:tcPr>
+          <w:p>
+            <w:pPr>
+              <w:spacing w:after="60" w:line="300"/>
+              <w:jc w:val="left"/>
+            </w:pPr>
+            <w:r>
+              <w:rPr>
+                <w:rFonts w:ascii="Calibri" w:cs="Calibri" w:eastAsia="Calibri" w:hAnsi="Calibri"/>
+                <w:b w:val="false"/>
+                <w:bCs w:val="false"/>
+                <w:color w:val="10213F"/>
+                <w:sz w:val="20"/>
+                <w:szCs w:val="20"/>
+              </w:rPr>
+              <w:t xml:space="preserve">Aceptado</w:t>
+            </w:r>
+          </w:p>
+        </w:tc>
+      </w:tr>
+      <w:tr>
+        <w:tc>
+          <w:tcPr>
+            <w:tcW w:type="dxa" w:w="600"/>
+            <w:shd w:fill="F3F7FC" w:color="auto" w:val="clear"/>
+          </w:tcPr>
+          <w:p>
+            <w:pPr>
+              <w:spacing w:after="60" w:line="300"/>
+              <w:jc w:val="left"/>
+            </w:pPr>
+            <w:r>
+              <w:rPr>
+                <w:rFonts w:ascii="Calibri" w:cs="Calibri" w:eastAsia="Calibri" w:hAnsi="Calibri"/>
+                <w:b w:val="false"/>
+                <w:bCs w:val="false"/>
+                <w:color w:val="10213F"/>
+                <w:sz w:val="20"/>
+                <w:szCs w:val="20"/>
+              </w:rPr>
+              <w:t xml:space="preserve">CP-44</w:t>
+            </w:r>
+          </w:p>
+        </w:tc>
+        <w:tc>
+          <w:tcPr>
+            <w:tcW w:type="dxa" w:w="900"/>
+            <w:shd w:fill="F3F7FC" w:color="auto" w:val="clear"/>
+          </w:tcPr>
+          <w:p>
+            <w:pPr>
+              <w:spacing w:after="60" w:line="300"/>
+              <w:jc w:val="left"/>
+            </w:pPr>
+            <w:r>
+              <w:rPr>
+                <w:rFonts w:ascii="Calibri" w:cs="Calibri" w:eastAsia="Calibri" w:hAnsi="Calibri"/>
+                <w:b w:val="false"/>
+                <w:bCs w:val="false"/>
+                <w:color w:val="10213F"/>
+                <w:sz w:val="20"/>
+                <w:szCs w:val="20"/>
+              </w:rPr>
+              <w:t xml:space="preserve">RF-04 (topes) / Datos iniciales</w:t>
+            </w:r>
+          </w:p>
+        </w:tc>
+        <w:tc>
+          <w:tcPr>
+            <w:tcW w:type="dxa" w:w="900"/>
+            <w:shd w:fill="F3F7FC" w:color="auto" w:val="clear"/>
+          </w:tcPr>
+          <w:p>
+            <w:pPr>
+              <w:spacing w:after="60" w:line="300"/>
+              <w:jc w:val="left"/>
+            </w:pPr>
+            <w:r>
+              <w:rPr>
+                <w:rFonts w:ascii="Calibri" w:cs="Calibri" w:eastAsia="Calibri" w:hAnsi="Calibri"/>
+                <w:b w:val="false"/>
+                <w:bCs w:val="false"/>
+                <w:color w:val="10213F"/>
+                <w:sz w:val="20"/>
+                <w:szCs w:val="20"/>
+              </w:rPr>
+              <w:t xml:space="preserve">Válido (datos semilla)</w:t>
+            </w:r>
+          </w:p>
+        </w:tc>
+        <w:tc>
+          <w:tcPr>
+            <w:tcW w:type="dxa" w:w="1200"/>
+            <w:shd w:fill="F3F7FC" w:color="auto" w:val="clear"/>
+          </w:tcPr>
+          <w:p>
+            <w:pPr>
+              <w:spacing w:after="60" w:line="300"/>
+              <w:jc w:val="left"/>
+            </w:pPr>
+            <w:r>
+              <w:rPr>
+                <w:rFonts w:ascii="Calibri" w:cs="Calibri" w:eastAsia="Calibri" w:hAnsi="Calibri"/>
+                <w:b w:val="false"/>
+                <w:bCs w:val="false"/>
+                <w:color w:val="10213F"/>
+                <w:sz w:val="20"/>
+                <w:szCs w:val="20"/>
+              </w:rPr>
+              <w:t xml:space="preserve">Aplicación recién cargada, sin sesión</w:t>
+            </w:r>
+          </w:p>
+        </w:tc>
+        <w:tc>
+          <w:tcPr>
+            <w:tcW w:type="dxa" w:w="1200"/>
+            <w:shd w:fill="F3F7FC" w:color="auto" w:val="clear"/>
+          </w:tcPr>
+          <w:p>
+            <w:pPr>
+              <w:spacing w:after="60" w:line="300"/>
+              <w:jc w:val="left"/>
+            </w:pPr>
+            <w:r>
+              <w:rPr>
+                <w:rFonts w:ascii="Calibri" w:cs="Calibri" w:eastAsia="Calibri" w:hAnsi="Calibri"/>
+                <w:b w:val="false"/>
+                <w:bCs w:val="false"/>
+                <w:color w:val="10213F"/>
+                <w:sz w:val="20"/>
+                <w:szCs w:val="20"/>
+              </w:rPr>
+              <w:t xml:space="preserve">—</w:t>
+            </w:r>
+          </w:p>
+        </w:tc>
+        <w:tc>
+          <w:tcPr>
+            <w:tcW w:type="dxa" w:w="1400"/>
+            <w:shd w:fill="F3F7FC" w:color="auto" w:val="clear"/>
+          </w:tcPr>
+          <w:p>
+            <w:pPr>
+              <w:spacing w:after="60" w:line="300"/>
+              <w:jc w:val="left"/>
+            </w:pPr>
+            <w:r>
+              <w:rPr>
+                <w:rFonts w:ascii="Calibri" w:cs="Calibri" w:eastAsia="Calibri" w:hAnsi="Calibri"/>
+                <w:b w:val="false"/>
+                <w:bCs w:val="false"/>
+                <w:color w:val="10213F"/>
+                <w:sz w:val="20"/>
+                <w:szCs w:val="20"/>
+              </w:rPr>
+              <w:t xml:space="preserve">1. Cargar la aplicación. 2. Listar los clientes y sumar disponible + bolsillos</w:t>
+            </w:r>
+          </w:p>
+        </w:tc>
+        <w:tc>
+          <w:tcPr>
+            <w:tcW w:type="dxa" w:w="2200"/>
+            <w:shd w:fill="F3F7FC" w:color="auto" w:val="clear"/>
+          </w:tcPr>
+          <w:p>
+            <w:pPr>
+              <w:spacing w:after="60" w:line="300"/>
+              <w:jc w:val="left"/>
+            </w:pPr>
+            <w:r>
+              <w:rPr>
+                <w:rFonts w:ascii="Calibri" w:cs="Calibri" w:eastAsia="Calibri" w:hAnsi="Calibri"/>
+                <w:b w:val="false"/>
+                <w:bCs w:val="false"/>
+                <w:color w:val="10213F"/>
+                <w:sz w:val="20"/>
+                <w:szCs w:val="20"/>
+              </w:rPr>
+              <w:t xml:space="preserve">El sistema arranca con 6 clientes y $18.000.000 en total.</w:t>
+            </w:r>
+          </w:p>
+        </w:tc>
+        <w:tc>
+          <w:tcPr>
+            <w:tcW w:type="dxa" w:w="800"/>
+            <w:shd w:fill="F3F7FC" w:color="auto" w:val="clear"/>
+          </w:tcPr>
+          <w:p>
+            <w:pPr>
+              <w:spacing w:after="60" w:line="300"/>
+              <w:jc w:val="left"/>
+            </w:pPr>
+            <w:r>
+              <w:rPr>
+                <w:rFonts w:ascii="Calibri" w:cs="Calibri" w:eastAsia="Calibri" w:hAnsi="Calibri"/>
+                <w:b w:val="false"/>
+                <w:bCs w:val="false"/>
+                <w:color w:val="10213F"/>
+                <w:sz w:val="20"/>
+                <w:szCs w:val="20"/>
+              </w:rPr>
+              <w:t xml:space="preserve">RF-04 (topes)</w:t>
+            </w:r>
+          </w:p>
+        </w:tc>
+        <w:tc>
+          <w:tcPr>
+            <w:tcW w:type="dxa" w:w="1000"/>
+            <w:shd w:fill="F3F7FC" w:color="auto" w:val="clear"/>
+          </w:tcPr>
+          <w:p>
+            <w:pPr>
+              <w:spacing w:after="60" w:line="300"/>
+              <w:jc w:val="left"/>
+            </w:pPr>
+            <w:r>
+              <w:rPr>
+                <w:rFonts w:ascii="Calibri" w:cs="Calibri" w:eastAsia="Calibri" w:hAnsi="Calibri"/>
+                <w:b w:val="false"/>
+                <w:bCs w:val="false"/>
+                <w:color w:val="10213F"/>
+                <w:sz w:val="20"/>
+                <w:szCs w:val="20"/>
+              </w:rPr>
+              <w:t xml:space="preserve">Aceptado</w:t>
+            </w:r>
+          </w:p>
+        </w:tc>
+      </w:tr>
+      <w:tr>
+        <w:tc>
+          <w:tcPr>
+            <w:tcW w:type="dxa" w:w="600"/>
+            <w:shd w:fill="FFFFFF" w:color="auto" w:val="clear"/>
+          </w:tcPr>
+          <w:p>
+            <w:pPr>
+              <w:spacing w:after="60" w:line="300"/>
+              <w:jc w:val="left"/>
+            </w:pPr>
+            <w:r>
+              <w:rPr>
+                <w:rFonts w:ascii="Calibri" w:cs="Calibri" w:eastAsia="Calibri" w:hAnsi="Calibri"/>
+                <w:b w:val="false"/>
+                <w:bCs w:val="false"/>
+                <w:color w:val="10213F"/>
+                <w:sz w:val="20"/>
+                <w:szCs w:val="20"/>
+              </w:rPr>
+              <w:t xml:space="preserve">CP-45</w:t>
+            </w:r>
+          </w:p>
+        </w:tc>
+        <w:tc>
+          <w:tcPr>
+            <w:tcW w:type="dxa" w:w="900"/>
+            <w:shd w:fill="FFFFFF" w:color="auto" w:val="clear"/>
+          </w:tcPr>
+          <w:p>
+            <w:pPr>
+              <w:spacing w:after="60" w:line="300"/>
+              <w:jc w:val="left"/>
+            </w:pPr>
+            <w:r>
+              <w:rPr>
+                <w:rFonts w:ascii="Calibri" w:cs="Calibri" w:eastAsia="Calibri" w:hAnsi="Calibri"/>
+                <w:b w:val="false"/>
+                <w:bCs w:val="false"/>
+                <w:color w:val="10213F"/>
+                <w:sz w:val="20"/>
+                <w:szCs w:val="20"/>
+              </w:rPr>
+              <w:t xml:space="preserve">RF-05</w:t>
+            </w:r>
+          </w:p>
+        </w:tc>
+        <w:tc>
+          <w:tcPr>
+            <w:tcW w:type="dxa" w:w="900"/>
+            <w:shd w:fill="FFFFFF" w:color="auto" w:val="clear"/>
+          </w:tcPr>
+          <w:p>
+            <w:pPr>
+              <w:spacing w:after="60" w:line="300"/>
+              <w:jc w:val="left"/>
+            </w:pPr>
+            <w:r>
+              <w:rPr>
+                <w:rFonts w:ascii="Calibri" w:cs="Calibri" w:eastAsia="Calibri" w:hAnsi="Calibri"/>
+                <w:b w:val="false"/>
+                <w:bCs w:val="false"/>
+                <w:color w:val="10213F"/>
+                <w:sz w:val="20"/>
+                <w:szCs w:val="20"/>
+              </w:rPr>
+              <w:t xml:space="preserve">Válido</w:t>
+            </w:r>
+          </w:p>
+        </w:tc>
+        <w:tc>
+          <w:tcPr>
+            <w:tcW w:type="dxa" w:w="1200"/>
+            <w:shd w:fill="FFFFFF" w:color="auto" w:val="clear"/>
+          </w:tcPr>
+          <w:p>
+            <w:pPr>
+              <w:spacing w:after="60" w:line="300"/>
+              <w:jc w:val="left"/>
+            </w:pPr>
+            <w:r>
+              <w:rPr>
+                <w:rFonts w:ascii="Calibri" w:cs="Calibri" w:eastAsia="Calibri" w:hAnsi="Calibri"/>
+                <w:b w:val="false"/>
+                <w:bCs w:val="false"/>
+                <w:color w:val="10213F"/>
+                <w:sz w:val="20"/>
+                <w:szCs w:val="20"/>
+              </w:rPr>
+              <w:t xml:space="preserve">Sesión de administrador</w:t>
+            </w:r>
+          </w:p>
+        </w:tc>
+        <w:tc>
+          <w:tcPr>
+            <w:tcW w:type="dxa" w:w="1200"/>
+            <w:shd w:fill="FFFFFF" w:color="auto" w:val="clear"/>
+          </w:tcPr>
+          <w:p>
+            <w:pPr>
+              <w:spacing w:after="60" w:line="300"/>
+              <w:jc w:val="left"/>
+            </w:pPr>
+            <w:r>
+              <w:rPr>
+                <w:rFonts w:ascii="Calibri" w:cs="Calibri" w:eastAsia="Calibri" w:hAnsi="Calibri"/>
+                <w:b w:val="false"/>
+                <w:bCs w:val="false"/>
+                <w:color w:val="10213F"/>
+                <w:sz w:val="20"/>
+                <w:szCs w:val="20"/>
+              </w:rPr>
+              <w:t xml:space="preserve">—</w:t>
+            </w:r>
+          </w:p>
+        </w:tc>
+        <w:tc>
+          <w:tcPr>
+            <w:tcW w:type="dxa" w:w="1400"/>
+            <w:shd w:fill="FFFFFF" w:color="auto" w:val="clear"/>
+          </w:tcPr>
+          <w:p>
+            <w:pPr>
+              <w:spacing w:after="60" w:line="300"/>
+              <w:jc w:val="left"/>
+            </w:pPr>
+            <w:r>
+              <w:rPr>
+                <w:rFonts w:ascii="Calibri" w:cs="Calibri" w:eastAsia="Calibri" w:hAnsi="Calibri"/>
+                <w:b w:val="false"/>
+                <w:bCs w:val="false"/>
+                <w:color w:val="10213F"/>
+                <w:sz w:val="20"/>
+                <w:szCs w:val="20"/>
+              </w:rPr>
+              <w:t xml:space="preserve">Abrir el panel de administrador</w:t>
+            </w:r>
+          </w:p>
+        </w:tc>
+        <w:tc>
+          <w:tcPr>
+            <w:tcW w:type="dxa" w:w="2200"/>
+            <w:shd w:fill="FFFFFF" w:color="auto" w:val="clear"/>
+          </w:tcPr>
+          <w:p>
+            <w:pPr>
+              <w:spacing w:after="60" w:line="300"/>
+              <w:jc w:val="left"/>
+            </w:pPr>
+            <w:r>
+              <w:rPr>
+                <w:rFonts w:ascii="Calibri" w:cs="Calibri" w:eastAsia="Calibri" w:hAnsi="Calibri"/>
+                <w:b w:val="false"/>
+                <w:bCs w:val="false"/>
+                <w:color w:val="10213F"/>
+                <w:sz w:val="20"/>
+                <w:szCs w:val="20"/>
+              </w:rPr>
+              <w:t xml:space="preserve">El resumen muestra 6 cuentas activas y $18.000.000 en custodia.</w:t>
+            </w:r>
+          </w:p>
+        </w:tc>
+        <w:tc>
+          <w:tcPr>
+            <w:tcW w:type="dxa" w:w="800"/>
+            <w:shd w:fill="FFFFFF" w:color="auto" w:val="clear"/>
+          </w:tcPr>
+          <w:p>
+            <w:pPr>
+              <w:spacing w:after="60" w:line="300"/>
+              <w:jc w:val="left"/>
+            </w:pPr>
+            <w:r>
+              <w:rPr>
+                <w:rFonts w:ascii="Calibri" w:cs="Calibri" w:eastAsia="Calibri" w:hAnsi="Calibri"/>
+                <w:b w:val="false"/>
+                <w:bCs w:val="false"/>
+                <w:color w:val="10213F"/>
+                <w:sz w:val="20"/>
+                <w:szCs w:val="20"/>
+              </w:rPr>
+              <w:t xml:space="preserve">Esc.4</w:t>
+            </w:r>
+          </w:p>
+        </w:tc>
+        <w:tc>
+          <w:tcPr>
+            <w:tcW w:type="dxa" w:w="1000"/>
+            <w:shd w:fill="FFFFFF" w:color="auto" w:val="clear"/>
+          </w:tcPr>
+          <w:p>
+            <w:pPr>
+              <w:spacing w:after="60" w:line="300"/>
+              <w:jc w:val="left"/>
+            </w:pPr>
+            <w:r>
+              <w:rPr>
+                <w:rFonts w:ascii="Calibri" w:cs="Calibri" w:eastAsia="Calibri" w:hAnsi="Calibri"/>
+                <w:b w:val="false"/>
+                <w:bCs w:val="false"/>
+                <w:color w:val="10213F"/>
+                <w:sz w:val="20"/>
+                <w:szCs w:val="20"/>
+              </w:rPr>
+              <w:t xml:space="preserve">Aceptado</w:t>
+            </w:r>
+          </w:p>
+        </w:tc>
+      </w:tr>
+      <w:tr>
+        <w:tc>
+          <w:tcPr>
+            <w:tcW w:type="dxa" w:w="600"/>
+            <w:shd w:fill="F3F7FC" w:color="auto" w:val="clear"/>
+          </w:tcPr>
+          <w:p>
+            <w:pPr>
+              <w:spacing w:after="60" w:line="300"/>
+              <w:jc w:val="left"/>
+            </w:pPr>
+            <w:r>
+              <w:rPr>
+                <w:rFonts w:ascii="Calibri" w:cs="Calibri" w:eastAsia="Calibri" w:hAnsi="Calibri"/>
+                <w:b w:val="false"/>
+                <w:bCs w:val="false"/>
+                <w:color w:val="10213F"/>
+                <w:sz w:val="20"/>
+                <w:szCs w:val="20"/>
+              </w:rPr>
+              <w:t xml:space="preserve">CP-46</w:t>
+            </w:r>
+          </w:p>
+        </w:tc>
+        <w:tc>
+          <w:tcPr>
+            <w:tcW w:type="dxa" w:w="900"/>
+            <w:shd w:fill="F3F7FC" w:color="auto" w:val="clear"/>
+          </w:tcPr>
+          <w:p>
+            <w:pPr>
+              <w:spacing w:after="60" w:line="300"/>
+              <w:jc w:val="left"/>
+            </w:pPr>
+            <w:r>
+              <w:rPr>
+                <w:rFonts w:ascii="Calibri" w:cs="Calibri" w:eastAsia="Calibri" w:hAnsi="Calibri"/>
+                <w:b w:val="false"/>
+                <w:bCs w:val="false"/>
+                <w:color w:val="10213F"/>
+                <w:sz w:val="20"/>
+                <w:szCs w:val="20"/>
+              </w:rPr>
+              <w:t xml:space="preserve">RF-05</w:t>
+            </w:r>
+          </w:p>
+        </w:tc>
+        <w:tc>
+          <w:tcPr>
+            <w:tcW w:type="dxa" w:w="900"/>
+            <w:shd w:fill="F3F7FC" w:color="auto" w:val="clear"/>
+          </w:tcPr>
+          <w:p>
+            <w:pPr>
+              <w:spacing w:after="60" w:line="300"/>
+              <w:jc w:val="left"/>
+            </w:pPr>
+            <w:r>
+              <w:rPr>
+                <w:rFonts w:ascii="Calibri" w:cs="Calibri" w:eastAsia="Calibri" w:hAnsi="Calibri"/>
+                <w:b w:val="false"/>
+                <w:bCs w:val="false"/>
+                <w:color w:val="10213F"/>
+                <w:sz w:val="20"/>
+                <w:szCs w:val="20"/>
+              </w:rPr>
+              <w:t xml:space="preserve">Válido</w:t>
+            </w:r>
+          </w:p>
+        </w:tc>
+        <w:tc>
+          <w:tcPr>
+            <w:tcW w:type="dxa" w:w="1200"/>
+            <w:shd w:fill="F3F7FC" w:color="auto" w:val="clear"/>
+          </w:tcPr>
+          <w:p>
+            <w:pPr>
+              <w:spacing w:after="60" w:line="300"/>
+              <w:jc w:val="left"/>
+            </w:pPr>
+            <w:r>
+              <w:rPr>
+                <w:rFonts w:ascii="Calibri" w:cs="Calibri" w:eastAsia="Calibri" w:hAnsi="Calibri"/>
+                <w:b w:val="false"/>
+                <w:bCs w:val="false"/>
+                <w:color w:val="10213F"/>
+                <w:sz w:val="20"/>
+                <w:szCs w:val="20"/>
+              </w:rPr>
+              <w:t xml:space="preserve">Sesión de administrador</w:t>
+            </w:r>
+          </w:p>
+        </w:tc>
+        <w:tc>
+          <w:tcPr>
+            <w:tcW w:type="dxa" w:w="1200"/>
+            <w:shd w:fill="F3F7FC" w:color="auto" w:val="clear"/>
+          </w:tcPr>
+          <w:p>
+            <w:pPr>
+              <w:spacing w:after="60" w:line="300"/>
+              <w:jc w:val="left"/>
+            </w:pPr>
+            <w:r>
+              <w:rPr>
+                <w:rFonts w:ascii="Calibri" w:cs="Calibri" w:eastAsia="Calibri" w:hAnsi="Calibri"/>
+                <w:b w:val="false"/>
+                <w:bCs w:val="false"/>
+                <w:color w:val="10213F"/>
+                <w:sz w:val="20"/>
+                <w:szCs w:val="20"/>
+              </w:rPr>
+              <w:t xml:space="preserve">Documento 1023456789</w:t>
+            </w:r>
+          </w:p>
+        </w:tc>
+        <w:tc>
+          <w:tcPr>
+            <w:tcW w:type="dxa" w:w="1400"/>
+            <w:shd w:fill="F3F7FC" w:color="auto" w:val="clear"/>
+          </w:tcPr>
+          <w:p>
+            <w:pPr>
+              <w:spacing w:after="60" w:line="300"/>
+              <w:jc w:val="left"/>
+            </w:pPr>
+            <w:r>
+              <w:rPr>
+                <w:rFonts w:ascii="Calibri" w:cs="Calibri" w:eastAsia="Calibri" w:hAnsi="Calibri"/>
+                <w:b w:val="false"/>
+                <w:bCs w:val="false"/>
+                <w:color w:val="10213F"/>
+                <w:sz w:val="20"/>
+                <w:szCs w:val="20"/>
+              </w:rPr>
+              <w:t xml:space="preserve">Pulsar Ver en la fila del cliente</w:t>
+            </w:r>
+          </w:p>
+        </w:tc>
+        <w:tc>
+          <w:tcPr>
+            <w:tcW w:type="dxa" w:w="2200"/>
+            <w:shd w:fill="F3F7FC" w:color="auto" w:val="clear"/>
+          </w:tcPr>
+          <w:p>
+            <w:pPr>
+              <w:spacing w:after="60" w:line="300"/>
+              <w:jc w:val="left"/>
+            </w:pPr>
+            <w:r>
+              <w:rPr>
+                <w:rFonts w:ascii="Calibri" w:cs="Calibri" w:eastAsia="Calibri" w:hAnsi="Calibri"/>
+                <w:b w:val="false"/>
+                <w:bCs w:val="false"/>
+                <w:color w:val="10213F"/>
+                <w:sz w:val="20"/>
+                <w:szCs w:val="20"/>
+              </w:rPr>
+              <w:t xml:space="preserve">El detalle muestra disponible, bolsillos, correo, topes y sus últimos movimientos; Cerrar lo oculta.</w:t>
+            </w:r>
+          </w:p>
+        </w:tc>
+        <w:tc>
+          <w:tcPr>
+            <w:tcW w:type="dxa" w:w="800"/>
+            <w:shd w:fill="F3F7FC" w:color="auto" w:val="clear"/>
+          </w:tcPr>
+          <w:p>
+            <w:pPr>
+              <w:spacing w:after="60" w:line="300"/>
+              <w:jc w:val="left"/>
+            </w:pPr>
+            <w:r>
+              <w:rPr>
+                <w:rFonts w:ascii="Calibri" w:cs="Calibri" w:eastAsia="Calibri" w:hAnsi="Calibri"/>
+                <w:b w:val="false"/>
+                <w:bCs w:val="false"/>
+                <w:color w:val="10213F"/>
+                <w:sz w:val="20"/>
+                <w:szCs w:val="20"/>
+              </w:rPr>
+              <w:t xml:space="preserve">Esc.4</w:t>
+            </w:r>
+          </w:p>
+        </w:tc>
+        <w:tc>
+          <w:tcPr>
+            <w:tcW w:type="dxa" w:w="1000"/>
+            <w:shd w:fill="F3F7FC" w:color="auto" w:val="clear"/>
+          </w:tcPr>
+          <w:p>
+            <w:pPr>
+              <w:spacing w:after="60" w:line="300"/>
+              <w:jc w:val="left"/>
+            </w:pPr>
+            <w:r>
+              <w:rPr>
+                <w:rFonts w:ascii="Calibri" w:cs="Calibri" w:eastAsia="Calibri" w:hAnsi="Calibri"/>
+                <w:b w:val="false"/>
+                <w:bCs w:val="false"/>
+                <w:color w:val="10213F"/>
+                <w:sz w:val="20"/>
+                <w:szCs w:val="20"/>
+              </w:rPr>
+              <w:t xml:space="preserve">Aceptado</w:t>
+            </w:r>
+          </w:p>
+        </w:tc>
+      </w:tr>
+      <w:tr>
+        <w:tc>
+          <w:tcPr>
+            <w:tcW w:type="dxa" w:w="600"/>
+            <w:shd w:fill="FFFFFF" w:color="auto" w:val="clear"/>
+          </w:tcPr>
+          <w:p>
+            <w:pPr>
+              <w:spacing w:after="60" w:line="300"/>
+              <w:jc w:val="left"/>
+            </w:pPr>
+            <w:r>
+              <w:rPr>
+                <w:rFonts w:ascii="Calibri" w:cs="Calibri" w:eastAsia="Calibri" w:hAnsi="Calibri"/>
+                <w:b w:val="false"/>
+                <w:bCs w:val="false"/>
+                <w:color w:val="10213F"/>
+                <w:sz w:val="20"/>
+                <w:szCs w:val="20"/>
+              </w:rPr>
+              <w:t xml:space="preserve">CP-47</w:t>
+            </w:r>
+          </w:p>
+        </w:tc>
+        <w:tc>
+          <w:tcPr>
+            <w:tcW w:type="dxa" w:w="900"/>
+            <w:shd w:fill="FFFFFF" w:color="auto" w:val="clear"/>
+          </w:tcPr>
+          <w:p>
+            <w:pPr>
+              <w:spacing w:after="60" w:line="300"/>
+              <w:jc w:val="left"/>
+            </w:pPr>
+            <w:r>
+              <w:rPr>
+                <w:rFonts w:ascii="Calibri" w:cs="Calibri" w:eastAsia="Calibri" w:hAnsi="Calibri"/>
+                <w:b w:val="false"/>
+                <w:bCs w:val="false"/>
+                <w:color w:val="10213F"/>
+                <w:sz w:val="20"/>
+                <w:szCs w:val="20"/>
+              </w:rPr>
+              <w:t xml:space="preserve">RF-05</w:t>
+            </w:r>
+          </w:p>
+        </w:tc>
+        <w:tc>
+          <w:tcPr>
+            <w:tcW w:type="dxa" w:w="900"/>
+            <w:shd w:fill="FFFFFF" w:color="auto" w:val="clear"/>
+          </w:tcPr>
+          <w:p>
+            <w:pPr>
+              <w:spacing w:after="60" w:line="300"/>
+              <w:jc w:val="left"/>
+            </w:pPr>
+            <w:r>
+              <w:rPr>
+                <w:rFonts w:ascii="Calibri" w:cs="Calibri" w:eastAsia="Calibri" w:hAnsi="Calibri"/>
+                <w:b w:val="false"/>
+                <w:bCs w:val="false"/>
+                <w:color w:val="10213F"/>
+                <w:sz w:val="20"/>
+                <w:szCs w:val="20"/>
+              </w:rPr>
+              <w:t xml:space="preserve">Válido</w:t>
+            </w:r>
+          </w:p>
+        </w:tc>
+        <w:tc>
+          <w:tcPr>
+            <w:tcW w:type="dxa" w:w="1200"/>
+            <w:shd w:fill="FFFFFF" w:color="auto" w:val="clear"/>
+          </w:tcPr>
+          <w:p>
+            <w:pPr>
+              <w:spacing w:after="60" w:line="300"/>
+              <w:jc w:val="left"/>
+            </w:pPr>
+            <w:r>
+              <w:rPr>
+                <w:rFonts w:ascii="Calibri" w:cs="Calibri" w:eastAsia="Calibri" w:hAnsi="Calibri"/>
+                <w:b w:val="false"/>
+                <w:bCs w:val="false"/>
+                <w:color w:val="10213F"/>
+                <w:sz w:val="20"/>
+                <w:szCs w:val="20"/>
+              </w:rPr>
+              <w:t xml:space="preserve">Sesión de administrador</w:t>
+            </w:r>
+          </w:p>
+        </w:tc>
+        <w:tc>
+          <w:tcPr>
+            <w:tcW w:type="dxa" w:w="1200"/>
+            <w:shd w:fill="FFFFFF" w:color="auto" w:val="clear"/>
+          </w:tcPr>
+          <w:p>
+            <w:pPr>
+              <w:spacing w:after="60" w:line="300"/>
+              <w:jc w:val="left"/>
+            </w:pPr>
+            <w:r>
+              <w:rPr>
+                <w:rFonts w:ascii="Calibri" w:cs="Calibri" w:eastAsia="Calibri" w:hAnsi="Calibri"/>
+                <w:b w:val="false"/>
+                <w:bCs w:val="false"/>
+                <w:color w:val="10213F"/>
+                <w:sz w:val="20"/>
+                <w:szCs w:val="20"/>
+              </w:rPr>
+              <w:t xml:space="preserve">—</w:t>
+            </w:r>
+          </w:p>
+        </w:tc>
+        <w:tc>
+          <w:tcPr>
+            <w:tcW w:type="dxa" w:w="1400"/>
+            <w:shd w:fill="FFFFFF" w:color="auto" w:val="clear"/>
+          </w:tcPr>
+          <w:p>
+            <w:pPr>
+              <w:spacing w:after="60" w:line="300"/>
+              <w:jc w:val="left"/>
+            </w:pPr>
+            <w:r>
+              <w:rPr>
+                <w:rFonts w:ascii="Calibri" w:cs="Calibri" w:eastAsia="Calibri" w:hAnsi="Calibri"/>
+                <w:b w:val="false"/>
+                <w:bCs w:val="false"/>
+                <w:color w:val="10213F"/>
+                <w:sz w:val="20"/>
+                <w:szCs w:val="20"/>
+              </w:rPr>
+              <w:t xml:space="preserve">Abrir Historial global</w:t>
+            </w:r>
+          </w:p>
+        </w:tc>
+        <w:tc>
+          <w:tcPr>
+            <w:tcW w:type="dxa" w:w="2200"/>
+            <w:shd w:fill="FFFFFF" w:color="auto" w:val="clear"/>
+          </w:tcPr>
+          <w:p>
+            <w:pPr>
+              <w:spacing w:after="60" w:line="300"/>
+              <w:jc w:val="left"/>
+            </w:pPr>
+            <w:r>
+              <w:rPr>
+                <w:rFonts w:ascii="Calibri" w:cs="Calibri" w:eastAsia="Calibri" w:hAnsi="Calibri"/>
+                <w:b w:val="false"/>
+                <w:bCs w:val="false"/>
+                <w:color w:val="10213F"/>
+                <w:sz w:val="20"/>
+                <w:szCs w:val="20"/>
+              </w:rPr>
+              <w:t xml:space="preserve">Se listan todas las operaciones del sistema, de todas las cuentas.</w:t>
+            </w:r>
+          </w:p>
+        </w:tc>
+        <w:tc>
+          <w:tcPr>
+            <w:tcW w:type="dxa" w:w="800"/>
+            <w:shd w:fill="FFFFFF" w:color="auto" w:val="clear"/>
+          </w:tcPr>
+          <w:p>
+            <w:pPr>
+              <w:spacing w:after="60" w:line="300"/>
+              <w:jc w:val="left"/>
+            </w:pPr>
+            <w:r>
+              <w:rPr>
+                <w:rFonts w:ascii="Calibri" w:cs="Calibri" w:eastAsia="Calibri" w:hAnsi="Calibri"/>
+                <w:b w:val="false"/>
+                <w:bCs w:val="false"/>
+                <w:color w:val="10213F"/>
+                <w:sz w:val="20"/>
+                <w:szCs w:val="20"/>
+              </w:rPr>
+              <w:t xml:space="preserve">Esc.4</w:t>
+            </w:r>
+          </w:p>
+        </w:tc>
+        <w:tc>
+          <w:tcPr>
+            <w:tcW w:type="dxa" w:w="1000"/>
+            <w:shd w:fill="FFFFFF" w:color="auto" w:val="clear"/>
+          </w:tcPr>
+          <w:p>
+            <w:pPr>
+              <w:spacing w:after="60" w:line="300"/>
+              <w:jc w:val="left"/>
+            </w:pPr>
+            <w:r>
+              <w:rPr>
+                <w:rFonts w:ascii="Calibri" w:cs="Calibri" w:eastAsia="Calibri" w:hAnsi="Calibri"/>
+                <w:b w:val="false"/>
+                <w:bCs w:val="false"/>
+                <w:color w:val="10213F"/>
+                <w:sz w:val="20"/>
+                <w:szCs w:val="20"/>
+              </w:rPr>
+              <w:t xml:space="preserve">Aceptado</w:t>
+            </w:r>
+          </w:p>
+        </w:tc>
+      </w:tr>
+      <w:tr>
+        <w:tc>
+          <w:tcPr>
+            <w:tcW w:type="dxa" w:w="600"/>
+            <w:shd w:fill="F3F7FC" w:color="auto" w:val="clear"/>
+          </w:tcPr>
+          <w:p>
+            <w:pPr>
+              <w:spacing w:after="60" w:line="300"/>
+              <w:jc w:val="left"/>
+            </w:pPr>
+            <w:r>
+              <w:rPr>
+                <w:rFonts w:ascii="Calibri" w:cs="Calibri" w:eastAsia="Calibri" w:hAnsi="Calibri"/>
+                <w:b w:val="false"/>
+                <w:bCs w:val="false"/>
+                <w:color w:val="10213F"/>
+                <w:sz w:val="20"/>
+                <w:szCs w:val="20"/>
+              </w:rPr>
+              <w:t xml:space="preserve">CP-48</w:t>
+            </w:r>
+          </w:p>
+        </w:tc>
+        <w:tc>
+          <w:tcPr>
+            <w:tcW w:type="dxa" w:w="900"/>
+            <w:shd w:fill="F3F7FC" w:color="auto" w:val="clear"/>
+          </w:tcPr>
+          <w:p>
+            <w:pPr>
+              <w:spacing w:after="60" w:line="300"/>
+              <w:jc w:val="left"/>
+            </w:pPr>
+            <w:r>
+              <w:rPr>
+                <w:rFonts w:ascii="Calibri" w:cs="Calibri" w:eastAsia="Calibri" w:hAnsi="Calibri"/>
+                <w:b w:val="false"/>
+                <w:bCs w:val="false"/>
+                <w:color w:val="10213F"/>
+                <w:sz w:val="20"/>
+                <w:szCs w:val="20"/>
+              </w:rPr>
+              <w:t xml:space="preserve">RF-05</w:t>
+            </w:r>
+          </w:p>
+        </w:tc>
+        <w:tc>
+          <w:tcPr>
+            <w:tcW w:type="dxa" w:w="900"/>
+            <w:shd w:fill="F3F7FC" w:color="auto" w:val="clear"/>
+          </w:tcPr>
+          <w:p>
+            <w:pPr>
+              <w:spacing w:after="60" w:line="300"/>
+              <w:jc w:val="left"/>
+            </w:pPr>
+            <w:r>
+              <w:rPr>
+                <w:rFonts w:ascii="Calibri" w:cs="Calibri" w:eastAsia="Calibri" w:hAnsi="Calibri"/>
+                <w:b w:val="false"/>
+                <w:bCs w:val="false"/>
+                <w:color w:val="10213F"/>
+                <w:sz w:val="20"/>
+                <w:szCs w:val="20"/>
+              </w:rPr>
+              <w:t xml:space="preserve">Válido (filtros)</w:t>
+            </w:r>
+          </w:p>
+        </w:tc>
+        <w:tc>
+          <w:tcPr>
+            <w:tcW w:type="dxa" w:w="1200"/>
+            <w:shd w:fill="F3F7FC" w:color="auto" w:val="clear"/>
+          </w:tcPr>
+          <w:p>
+            <w:pPr>
+              <w:spacing w:after="60" w:line="300"/>
+              <w:jc w:val="left"/>
+            </w:pPr>
+            <w:r>
+              <w:rPr>
+                <w:rFonts w:ascii="Calibri" w:cs="Calibri" w:eastAsia="Calibri" w:hAnsi="Calibri"/>
+                <w:b w:val="false"/>
+                <w:bCs w:val="false"/>
+                <w:color w:val="10213F"/>
+                <w:sz w:val="20"/>
+                <w:szCs w:val="20"/>
+              </w:rPr>
+              <w:t xml:space="preserve">Sesión de administrador</w:t>
+            </w:r>
+          </w:p>
+        </w:tc>
+        <w:tc>
+          <w:tcPr>
+            <w:tcW w:type="dxa" w:w="1200"/>
+            <w:shd w:fill="F3F7FC" w:color="auto" w:val="clear"/>
+          </w:tcPr>
+          <w:p>
+            <w:pPr>
+              <w:spacing w:after="60" w:line="300"/>
+              <w:jc w:val="left"/>
+            </w:pPr>
+            <w:r>
+              <w:rPr>
+                <w:rFonts w:ascii="Calibri" w:cs="Calibri" w:eastAsia="Calibri" w:hAnsi="Calibri"/>
+                <w:b w:val="false"/>
+                <w:bCs w:val="false"/>
+                <w:color w:val="10213F"/>
+                <w:sz w:val="20"/>
+                <w:szCs w:val="20"/>
+              </w:rPr>
+              <w:t xml:space="preserve">Estado=Rechazada; luego cuenta 000-000-000</w:t>
+            </w:r>
+          </w:p>
+        </w:tc>
+        <w:tc>
+          <w:tcPr>
+            <w:tcW w:type="dxa" w:w="1400"/>
+            <w:shd w:fill="F3F7FC" w:color="auto" w:val="clear"/>
+          </w:tcPr>
+          <w:p>
+            <w:pPr>
+              <w:spacing w:after="60" w:line="300"/>
+              <w:jc w:val="left"/>
+            </w:pPr>
+            <w:r>
+              <w:rPr>
+                <w:rFonts w:ascii="Calibri" w:cs="Calibri" w:eastAsia="Calibri" w:hAnsi="Calibri"/>
+                <w:b w:val="false"/>
+                <w:bCs w:val="false"/>
+                <w:color w:val="10213F"/>
+                <w:sz w:val="20"/>
+                <w:szCs w:val="20"/>
+              </w:rPr>
+              <w:t xml:space="preserve">Filtrar, limpiar y volver a filtrar</w:t>
+            </w:r>
+          </w:p>
+        </w:tc>
+        <w:tc>
+          <w:tcPr>
+            <w:tcW w:type="dxa" w:w="2200"/>
+            <w:shd w:fill="F3F7FC" w:color="auto" w:val="clear"/>
+          </w:tcPr>
+          <w:p>
+            <w:pPr>
+              <w:spacing w:after="60" w:line="300"/>
+              <w:jc w:val="left"/>
+            </w:pPr>
+            <w:r>
+              <w:rPr>
+                <w:rFonts w:ascii="Calibri" w:cs="Calibri" w:eastAsia="Calibri" w:hAnsi="Calibri"/>
+                <w:b w:val="false"/>
+                <w:bCs w:val="false"/>
+                <w:color w:val="10213F"/>
+                <w:sz w:val="20"/>
+                <w:szCs w:val="20"/>
+              </w:rPr>
+              <w:t xml:space="preserve">Solo aparecen las rechazadas; al limpiar vuelven todas; una cuenta inexistente muestra el aviso de que nada coincide.</w:t>
+            </w:r>
+          </w:p>
+        </w:tc>
+        <w:tc>
+          <w:tcPr>
+            <w:tcW w:type="dxa" w:w="800"/>
+            <w:shd w:fill="F3F7FC" w:color="auto" w:val="clear"/>
+          </w:tcPr>
+          <w:p>
+            <w:pPr>
+              <w:spacing w:after="60" w:line="300"/>
+              <w:jc w:val="left"/>
+            </w:pPr>
+            <w:r>
+              <w:rPr>
+                <w:rFonts w:ascii="Calibri" w:cs="Calibri" w:eastAsia="Calibri" w:hAnsi="Calibri"/>
+                <w:b w:val="false"/>
+                <w:bCs w:val="false"/>
+                <w:color w:val="10213F"/>
+                <w:sz w:val="20"/>
+                <w:szCs w:val="20"/>
+              </w:rPr>
+              <w:t xml:space="preserve">Esc.4</w:t>
+            </w:r>
+          </w:p>
+        </w:tc>
+        <w:tc>
+          <w:tcPr>
+            <w:tcW w:type="dxa" w:w="1000"/>
+            <w:shd w:fill="F3F7FC" w:color="auto" w:val="clear"/>
+          </w:tcPr>
+          <w:p>
+            <w:pPr>
+              <w:spacing w:after="60" w:line="300"/>
+              <w:jc w:val="left"/>
+            </w:pPr>
+            <w:r>
+              <w:rPr>
+                <w:rFonts w:ascii="Calibri" w:cs="Calibri" w:eastAsia="Calibri" w:hAnsi="Calibri"/>
+                <w:b w:val="false"/>
+                <w:bCs w:val="false"/>
+                <w:color w:val="10213F"/>
+                <w:sz w:val="20"/>
+                <w:szCs w:val="20"/>
+              </w:rPr>
+              <w:t xml:space="preserve">Aceptado</w:t>
+            </w:r>
+          </w:p>
+        </w:tc>
+      </w:tr>
     </w:tbl>
     <w:p>
       <w:r>
@@ -10539,7 +12838,7 @@
           <w:sz w:val="22"/>
           <w:szCs w:val="22"/>
         </w:rPr>
-        <w:t xml:space="preserve">Fecha de ejecución: 20/10/2026 19:56</w:t>
+        <w:t xml:space="preserve">Fecha de ejecución: 27/10/2026 13:55</w:t>
       </w:r>
     </w:p>
     <w:p>
@@ -10608,7 +12907,7 @@
           <w:sz w:val="22"/>
           <w:szCs w:val="22"/>
         </w:rPr>
-        <w:t xml:space="preserve">Casos diseñados: 37</w:t>
+        <w:t xml:space="preserve">Casos diseñados: 48</w:t>
       </w:r>
     </w:p>
     <w:p>
@@ -10631,7 +12930,7 @@
           <w:sz w:val="22"/>
           <w:szCs w:val="22"/>
         </w:rPr>
-        <w:t xml:space="preserve">Pruebas ejecutadas: 40</w:t>
+        <w:t xml:space="preserve">Pruebas ejecutadas: 51</w:t>
       </w:r>
     </w:p>
     <w:p>
@@ -10654,7 +12953,7 @@
           <w:sz w:val="22"/>
           <w:szCs w:val="22"/>
         </w:rPr>
-        <w:t xml:space="preserve">Aprobadas: 40</w:t>
+        <w:t xml:space="preserve">Aprobadas: 51</w:t>
       </w:r>
     </w:p>
     <w:p>
@@ -10696,7 +12995,7 @@
           <w:sz w:val="20"/>
           <w:szCs w:val="20"/>
         </w:rPr>
-        <w:t xml:space="preserve">Los 37 casos disenados se ejecutaron como 40 pruebas automatizadas: CP-23, CP-35 y CP-36 se desdoblaron en dos pruebas cada uno (CP-23b busqueda por correo, CP-35b filtro de rango y CP-36b acceso del rol contable) para aislar la condicion verificada.</w:t>
+        <w:t xml:space="preserve">Los 44 casos disenados se ejecutaron como 47 pruebas automatizadas: CP-23, CP-35 y CP-36 se desdoblaron en dos pruebas cada uno (CP-23b busqueda por correo, CP-35b filtro de rango y CP-36b acceso del rol contable) para aislar la condicion verificada.</w:t>
       </w:r>
     </w:p>
     <w:p>
@@ -10826,7 +13125,7 @@
                 <w:sz w:val="20"/>
                 <w:szCs w:val="20"/>
               </w:rPr>
-              <w:t xml:space="preserve">40</w:t>
+              <w:t xml:space="preserve">51</w:t>
             </w:r>
           </w:p>
         </w:tc>
@@ -10874,7 +13173,7 @@
                 <w:sz w:val="20"/>
                 <w:szCs w:val="20"/>
               </w:rPr>
-              <w:t xml:space="preserve">40 (100 %)</w:t>
+              <w:t xml:space="preserve">51 (100 %)</w:t>
             </w:r>
           </w:p>
         </w:tc>
@@ -10970,7 +13269,7 @@
                 <w:sz w:val="20"/>
                 <w:szCs w:val="20"/>
               </w:rPr>
-              <w:t xml:space="preserve">87,04 %</w:t>
+              <w:t xml:space="preserve">89,41 %</w:t>
             </w:r>
           </w:p>
         </w:tc>
@@ -11018,7 +13317,7 @@
                 <w:sz w:val="20"/>
                 <w:szCs w:val="20"/>
               </w:rPr>
-              <w:t xml:space="preserve">84,09 %</w:t>
+              <w:t xml:space="preserve">82,19 %</w:t>
             </w:r>
           </w:p>
         </w:tc>
@@ -11066,7 +13365,7 @@
                 <w:sz w:val="20"/>
                 <w:szCs w:val="20"/>
               </w:rPr>
-              <w:t xml:space="preserve">82,53 %</w:t>
+              <w:t xml:space="preserve">84,21 %</w:t>
             </w:r>
           </w:p>
         </w:tc>
@@ -13470,6 +15769,286 @@
           </w:p>
         </w:tc>
       </w:tr>
+      <w:tr>
+        <w:tc>
+          <w:tcPr>
+            <w:tcW w:type="dxa" w:w="700"/>
+            <w:shd w:fill="F3F7FC" w:color="auto" w:val="clear"/>
+          </w:tcPr>
+          <w:p>
+            <w:pPr>
+              <w:spacing w:after="60" w:line="300"/>
+              <w:jc w:val="left"/>
+            </w:pPr>
+            <w:r>
+              <w:rPr>
+                <w:rFonts w:ascii="Calibri" w:cs="Calibri" w:eastAsia="Calibri" w:hAnsi="Calibri"/>
+                <w:b w:val="false"/>
+                <w:bCs w:val="false"/>
+                <w:color w:val="10213F"/>
+                <w:sz w:val="20"/>
+                <w:szCs w:val="20"/>
+              </w:rPr>
+              <w:t xml:space="preserve">D-12</w:t>
+            </w:r>
+          </w:p>
+        </w:tc>
+        <w:tc>
+          <w:tcPr>
+            <w:tcW w:type="dxa" w:w="900"/>
+            <w:shd w:fill="F3F7FC" w:color="auto" w:val="clear"/>
+          </w:tcPr>
+          <w:p>
+            <w:pPr>
+              <w:spacing w:after="60" w:line="300"/>
+              <w:jc w:val="left"/>
+            </w:pPr>
+            <w:r>
+              <w:rPr>
+                <w:rFonts w:ascii="Calibri" w:cs="Calibri" w:eastAsia="Calibri" w:hAnsi="Calibri"/>
+                <w:b w:val="false"/>
+                <w:bCs w:val="false"/>
+                <w:color w:val="10213F"/>
+                <w:sz w:val="20"/>
+                <w:szCs w:val="20"/>
+              </w:rPr>
+              <w:t xml:space="preserve">CP-38 / CP-39</w:t>
+            </w:r>
+          </w:p>
+        </w:tc>
+        <w:tc>
+          <w:tcPr>
+            <w:tcW w:type="dxa" w:w="2600"/>
+            <w:shd w:fill="F3F7FC" w:color="auto" w:val="clear"/>
+          </w:tcPr>
+          <w:p>
+            <w:pPr>
+              <w:spacing w:after="60" w:line="300"/>
+              <w:jc w:val="left"/>
+            </w:pPr>
+            <w:r>
+              <w:rPr>
+                <w:rFonts w:ascii="Calibri" w:cs="Calibri" w:eastAsia="Calibri" w:hAnsi="Calibri"/>
+                <w:b w:val="false"/>
+                <w:bCs w:val="false"/>
+                <w:color w:val="10213F"/>
+                <w:sz w:val="20"/>
+                <w:szCs w:val="20"/>
+              </w:rPr>
+              <w:t xml:space="preserve">El selector de cuenta destino listaba a todos los clientes del sistema con su nombre y número de cuenta, exponiendo datos personales de terceros a cualquier usuario autenticado.</w:t>
+            </w:r>
+          </w:p>
+        </w:tc>
+        <w:tc>
+          <w:tcPr>
+            <w:tcW w:type="dxa" w:w="2800"/>
+            <w:shd w:fill="F3F7FC" w:color="auto" w:val="clear"/>
+          </w:tcPr>
+          <w:p>
+            <w:pPr>
+              <w:spacing w:after="60" w:line="300"/>
+              <w:jc w:val="left"/>
+            </w:pPr>
+            <w:r>
+              <w:rPr>
+                <w:rFonts w:ascii="Calibri" w:cs="Calibri" w:eastAsia="Calibri" w:hAnsi="Calibri"/>
+                <w:b w:val="false"/>
+                <w:bCs w:val="false"/>
+                <w:color w:val="10213F"/>
+                <w:sz w:val="20"/>
+                <w:szCs w:val="20"/>
+              </w:rPr>
+              <w:t xml:space="preserve">1. Login María. 2. Abrir Transferir y desplegar el selector de destino. Esperado: solo la cuenta que el usuario escriba. Obtenido: la lista completa de clientes con nombre y número de cuenta.</w:t>
+            </w:r>
+          </w:p>
+        </w:tc>
+        <w:tc>
+          <w:tcPr>
+            <w:tcW w:type="dxa" w:w="1100"/>
+            <w:shd w:fill="F3F7FC" w:color="auto" w:val="clear"/>
+          </w:tcPr>
+          <w:p>
+            <w:pPr>
+              <w:spacing w:after="60" w:line="300"/>
+              <w:jc w:val="left"/>
+            </w:pPr>
+            <w:r>
+              <w:rPr>
+                <w:rFonts w:ascii="Calibri" w:cs="Calibri" w:eastAsia="Calibri" w:hAnsi="Calibri"/>
+                <w:b w:val="false"/>
+                <w:bCs w:val="false"/>
+                <w:color w:val="10213F"/>
+                <w:sz w:val="20"/>
+                <w:szCs w:val="20"/>
+              </w:rPr>
+              <w:t xml:space="preserve">Media</w:t>
+            </w:r>
+          </w:p>
+        </w:tc>
+        <w:tc>
+          <w:tcPr>
+            <w:tcW w:type="dxa" w:w="1700"/>
+            <w:shd w:fill="F3F7FC" w:color="auto" w:val="clear"/>
+          </w:tcPr>
+          <w:p>
+            <w:pPr>
+              <w:spacing w:after="60" w:line="300"/>
+              <w:jc w:val="left"/>
+            </w:pPr>
+            <w:r>
+              <w:rPr>
+                <w:rFonts w:ascii="Calibri" w:cs="Calibri" w:eastAsia="Calibri" w:hAnsi="Calibri"/>
+                <w:b w:val="false"/>
+                <w:bCs w:val="false"/>
+                <w:color w:val="10213F"/>
+                <w:sz w:val="20"/>
+                <w:szCs w:val="20"/>
+              </w:rPr>
+              <w:t xml:space="preserve">Corregido (campo de texto + confirmación del titular antes de enviar)</w:t>
+            </w:r>
+          </w:p>
+        </w:tc>
+      </w:tr>
+      <w:tr>
+        <w:tc>
+          <w:tcPr>
+            <w:tcW w:type="dxa" w:w="700"/>
+            <w:shd w:fill="FFFFFF" w:color="auto" w:val="clear"/>
+          </w:tcPr>
+          <w:p>
+            <w:pPr>
+              <w:spacing w:after="60" w:line="300"/>
+              <w:jc w:val="left"/>
+            </w:pPr>
+            <w:r>
+              <w:rPr>
+                <w:rFonts w:ascii="Calibri" w:cs="Calibri" w:eastAsia="Calibri" w:hAnsi="Calibri"/>
+                <w:b w:val="false"/>
+                <w:bCs w:val="false"/>
+                <w:color w:val="10213F"/>
+                <w:sz w:val="20"/>
+                <w:szCs w:val="20"/>
+              </w:rPr>
+              <w:t xml:space="preserve">D-13</w:t>
+            </w:r>
+          </w:p>
+        </w:tc>
+        <w:tc>
+          <w:tcPr>
+            <w:tcW w:type="dxa" w:w="900"/>
+            <w:shd w:fill="FFFFFF" w:color="auto" w:val="clear"/>
+          </w:tcPr>
+          <w:p>
+            <w:pPr>
+              <w:spacing w:after="60" w:line="300"/>
+              <w:jc w:val="left"/>
+            </w:pPr>
+            <w:r>
+              <w:rPr>
+                <w:rFonts w:ascii="Calibri" w:cs="Calibri" w:eastAsia="Calibri" w:hAnsi="Calibri"/>
+                <w:b w:val="false"/>
+                <w:bCs w:val="false"/>
+                <w:color w:val="10213F"/>
+                <w:sz w:val="20"/>
+                <w:szCs w:val="20"/>
+              </w:rPr>
+              <w:t xml:space="preserve">CP-41 / CP-42 / CP-43</w:t>
+            </w:r>
+          </w:p>
+        </w:tc>
+        <w:tc>
+          <w:tcPr>
+            <w:tcW w:type="dxa" w:w="2600"/>
+            <w:shd w:fill="FFFFFF" w:color="auto" w:val="clear"/>
+          </w:tcPr>
+          <w:p>
+            <w:pPr>
+              <w:spacing w:after="60" w:line="300"/>
+              <w:jc w:val="left"/>
+            </w:pPr>
+            <w:r>
+              <w:rPr>
+                <w:rFonts w:ascii="Calibri" w:cs="Calibri" w:eastAsia="Calibri" w:hAnsi="Calibri"/>
+                <w:b w:val="false"/>
+                <w:bCs w:val="false"/>
+                <w:color w:val="10213F"/>
+                <w:sz w:val="20"/>
+                <w:szCs w:val="20"/>
+              </w:rPr>
+              <w:t xml:space="preserve">RF-04 se titula "Gestión de transacciones y límites" pero no existía ningún tope de transferencia implementado.</w:t>
+            </w:r>
+          </w:p>
+        </w:tc>
+        <w:tc>
+          <w:tcPr>
+            <w:tcW w:type="dxa" w:w="2800"/>
+            <w:shd w:fill="FFFFFF" w:color="auto" w:val="clear"/>
+          </w:tcPr>
+          <w:p>
+            <w:pPr>
+              <w:spacing w:after="60" w:line="300"/>
+              <w:jc w:val="left"/>
+            </w:pPr>
+            <w:r>
+              <w:rPr>
+                <w:rFonts w:ascii="Calibri" w:cs="Calibri" w:eastAsia="Calibri" w:hAnsi="Calibri"/>
+                <w:b w:val="false"/>
+                <w:bCs w:val="false"/>
+                <w:color w:val="10213F"/>
+                <w:sz w:val="20"/>
+                <w:szCs w:val="20"/>
+              </w:rPr>
+              <w:t xml:space="preserve">Enviar transferencias sucesivas hasta agotar el disponible. Esperado: rechazo al superar un tope. Obtenido: no hay tope alguno, todas se procesan.</w:t>
+            </w:r>
+          </w:p>
+        </w:tc>
+        <w:tc>
+          <w:tcPr>
+            <w:tcW w:type="dxa" w:w="1100"/>
+            <w:shd w:fill="FFFFFF" w:color="auto" w:val="clear"/>
+          </w:tcPr>
+          <w:p>
+            <w:pPr>
+              <w:spacing w:after="60" w:line="300"/>
+              <w:jc w:val="left"/>
+            </w:pPr>
+            <w:r>
+              <w:rPr>
+                <w:rFonts w:ascii="Calibri" w:cs="Calibri" w:eastAsia="Calibri" w:hAnsi="Calibri"/>
+                <w:b w:val="false"/>
+                <w:bCs w:val="false"/>
+                <w:color w:val="10213F"/>
+                <w:sz w:val="20"/>
+                <w:szCs w:val="20"/>
+              </w:rPr>
+              <w:t xml:space="preserve">Media</w:t>
+            </w:r>
+          </w:p>
+        </w:tc>
+        <w:tc>
+          <w:tcPr>
+            <w:tcW w:type="dxa" w:w="1700"/>
+            <w:shd w:fill="FFFFFF" w:color="auto" w:val="clear"/>
+          </w:tcPr>
+          <w:p>
+            <w:pPr>
+              <w:spacing w:after="60" w:line="300"/>
+              <w:jc w:val="left"/>
+            </w:pPr>
+            <w:r>
+              <w:rPr>
+                <w:rFonts w:ascii="Calibri" w:cs="Calibri" w:eastAsia="Calibri" w:hAnsi="Calibri"/>
+                <w:b w:val="false"/>
+                <w:bCs w:val="false"/>
+                <w:color w:val="10213F"/>
+                <w:sz w:val="20"/>
+                <w:szCs w:val="20"/>
+              </w:rPr>
+              <w:t xml:space="preserve">Corregido (topes diario y mensual configurables por usuario, con rechazo registrado)</w:t>
+            </w:r>
+          </w:p>
+        </w:tc>
+      </w:tr>
     </w:tbl>
     <w:p>
       <w:pPr>
@@ -15178,6 +17757,240 @@
                 <w:szCs w:val="20"/>
               </w:rPr>
               <w:t xml:space="preserve">2/2 OK (CP-36, CP-36b)</w:t>
+            </w:r>
+          </w:p>
+        </w:tc>
+      </w:tr>
+      <w:tr>
+        <w:tc>
+          <w:tcPr>
+            <w:tcW w:type="dxa" w:w="1600"/>
+            <w:shd w:fill="FFFFFF" w:color="auto" w:val="clear"/>
+          </w:tcPr>
+          <w:p>
+            <w:pPr>
+              <w:spacing w:after="60" w:line="300"/>
+              <w:jc w:val="left"/>
+            </w:pPr>
+            <w:r>
+              <w:rPr>
+                <w:rFonts w:ascii="Calibri" w:cs="Calibri" w:eastAsia="Calibri" w:hAnsi="Calibri"/>
+                <w:b w:val="false"/>
+                <w:bCs w:val="false"/>
+                <w:color w:val="10213F"/>
+                <w:sz w:val="20"/>
+                <w:szCs w:val="20"/>
+              </w:rPr>
+              <w:t xml:space="preserve">RF-04 (topes)</w:t>
+            </w:r>
+          </w:p>
+        </w:tc>
+        <w:tc>
+          <w:tcPr>
+            <w:tcW w:type="dxa" w:w="2800"/>
+            <w:shd w:fill="FFFFFF" w:color="auto" w:val="clear"/>
+          </w:tcPr>
+          <w:p>
+            <w:pPr>
+              <w:spacing w:after="60" w:line="300"/>
+              <w:jc w:val="left"/>
+            </w:pPr>
+            <w:r>
+              <w:rPr>
+                <w:rFonts w:ascii="Calibri" w:cs="Calibri" w:eastAsia="Calibri" w:hAnsi="Calibri"/>
+                <w:b w:val="false"/>
+                <w:bCs w:val="false"/>
+                <w:color w:val="10213F"/>
+                <w:sz w:val="20"/>
+                <w:szCs w:val="20"/>
+              </w:rPr>
+              <w:t xml:space="preserve">CP-38, CP-39, CP-40, CP-41, CP-42, CP-43, CP-44</w:t>
+            </w:r>
+          </w:p>
+        </w:tc>
+        <w:tc>
+          <w:tcPr>
+            <w:tcW w:type="dxa" w:w="1600"/>
+            <w:shd w:fill="FFFFFF" w:color="auto" w:val="clear"/>
+          </w:tcPr>
+          <w:p>
+            <w:pPr>
+              <w:spacing w:after="60" w:line="300"/>
+              <w:jc w:val="left"/>
+            </w:pPr>
+            <w:r>
+              <w:rPr>
+                <w:rFonts w:ascii="Calibri" w:cs="Calibri" w:eastAsia="Calibri" w:hAnsi="Calibri"/>
+                <w:b w:val="false"/>
+                <w:bCs w:val="false"/>
+                <w:color w:val="10213F"/>
+                <w:sz w:val="20"/>
+                <w:szCs w:val="20"/>
+              </w:rPr>
+              <w:t xml:space="preserve">D-12, D-13</w:t>
+            </w:r>
+          </w:p>
+        </w:tc>
+        <w:tc>
+          <w:tcPr>
+            <w:tcW w:type="dxa" w:w="2400"/>
+            <w:shd w:fill="FFFFFF" w:color="auto" w:val="clear"/>
+          </w:tcPr>
+          <w:p>
+            <w:pPr>
+              <w:spacing w:after="60" w:line="300"/>
+              <w:jc w:val="left"/>
+            </w:pPr>
+            <w:r>
+              <w:rPr>
+                <w:rFonts w:ascii="Calibri" w:cs="Calibri" w:eastAsia="Calibri" w:hAnsi="Calibri"/>
+                <w:b w:val="false"/>
+                <w:bCs w:val="false"/>
+                <w:color w:val="10213F"/>
+                <w:sz w:val="20"/>
+                <w:szCs w:val="20"/>
+              </w:rPr>
+              <w:t xml:space="preserve">Confirmación del titular destino antes de enviar y topes diario/mensual configurables con rechazo registrado</w:t>
+            </w:r>
+          </w:p>
+        </w:tc>
+        <w:tc>
+          <w:tcPr>
+            <w:tcW w:type="dxa" w:w="1600"/>
+            <w:shd w:fill="FFFFFF" w:color="auto" w:val="clear"/>
+          </w:tcPr>
+          <w:p>
+            <w:pPr>
+              <w:spacing w:after="60" w:line="300"/>
+              <w:jc w:val="left"/>
+            </w:pPr>
+            <w:r>
+              <w:rPr>
+                <w:rFonts w:ascii="Calibri" w:cs="Calibri" w:eastAsia="Calibri" w:hAnsi="Calibri"/>
+                <w:b w:val="false"/>
+                <w:bCs w:val="false"/>
+                <w:color w:val="10213F"/>
+                <w:sz w:val="20"/>
+                <w:szCs w:val="20"/>
+              </w:rPr>
+              <w:t xml:space="preserve">7/7 OK (CP-38 a CP-44)</w:t>
+            </w:r>
+          </w:p>
+        </w:tc>
+      </w:tr>
+      <w:tr>
+        <w:tc>
+          <w:tcPr>
+            <w:tcW w:type="dxa" w:w="1600"/>
+            <w:shd w:fill="F3F7FC" w:color="auto" w:val="clear"/>
+          </w:tcPr>
+          <w:p>
+            <w:pPr>
+              <w:spacing w:after="60" w:line="300"/>
+              <w:jc w:val="left"/>
+            </w:pPr>
+            <w:r>
+              <w:rPr>
+                <w:rFonts w:ascii="Calibri" w:cs="Calibri" w:eastAsia="Calibri" w:hAnsi="Calibri"/>
+                <w:b w:val="false"/>
+                <w:bCs w:val="false"/>
+                <w:color w:val="10213F"/>
+                <w:sz w:val="20"/>
+                <w:szCs w:val="20"/>
+              </w:rPr>
+              <w:t xml:space="preserve">RF-05 (panel admin)</w:t>
+            </w:r>
+          </w:p>
+        </w:tc>
+        <w:tc>
+          <w:tcPr>
+            <w:tcW w:type="dxa" w:w="2800"/>
+            <w:shd w:fill="F3F7FC" w:color="auto" w:val="clear"/>
+          </w:tcPr>
+          <w:p>
+            <w:pPr>
+              <w:spacing w:after="60" w:line="300"/>
+              <w:jc w:val="left"/>
+            </w:pPr>
+            <w:r>
+              <w:rPr>
+                <w:rFonts w:ascii="Calibri" w:cs="Calibri" w:eastAsia="Calibri" w:hAnsi="Calibri"/>
+                <w:b w:val="false"/>
+                <w:bCs w:val="false"/>
+                <w:color w:val="10213F"/>
+                <w:sz w:val="20"/>
+                <w:szCs w:val="20"/>
+              </w:rPr>
+              <w:t xml:space="preserve">CP-45, CP-46, CP-47, CP-48</w:t>
+            </w:r>
+          </w:p>
+        </w:tc>
+        <w:tc>
+          <w:tcPr>
+            <w:tcW w:type="dxa" w:w="1600"/>
+            <w:shd w:fill="F3F7FC" w:color="auto" w:val="clear"/>
+          </w:tcPr>
+          <w:p>
+            <w:pPr>
+              <w:spacing w:after="60" w:line="300"/>
+              <w:jc w:val="left"/>
+            </w:pPr>
+            <w:r>
+              <w:rPr>
+                <w:rFonts w:ascii="Calibri" w:cs="Calibri" w:eastAsia="Calibri" w:hAnsi="Calibri"/>
+                <w:b w:val="false"/>
+                <w:bCs w:val="false"/>
+                <w:color w:val="10213F"/>
+                <w:sz w:val="20"/>
+                <w:szCs w:val="20"/>
+              </w:rPr>
+              <w:t xml:space="preserve">—</w:t>
+            </w:r>
+          </w:p>
+        </w:tc>
+        <w:tc>
+          <w:tcPr>
+            <w:tcW w:type="dxa" w:w="2400"/>
+            <w:shd w:fill="F3F7FC" w:color="auto" w:val="clear"/>
+          </w:tcPr>
+          <w:p>
+            <w:pPr>
+              <w:spacing w:after="60" w:line="300"/>
+              <w:jc w:val="left"/>
+            </w:pPr>
+            <w:r>
+              <w:rPr>
+                <w:rFonts w:ascii="Calibri" w:cs="Calibri" w:eastAsia="Calibri" w:hAnsi="Calibri"/>
+                <w:b w:val="false"/>
+                <w:bCs w:val="false"/>
+                <w:color w:val="10213F"/>
+                <w:sz w:val="20"/>
+                <w:szCs w:val="20"/>
+              </w:rPr>
+              <w:t xml:space="preserve">Resumen de operación, detalle de cuenta e historial global filtrable</w:t>
+            </w:r>
+          </w:p>
+        </w:tc>
+        <w:tc>
+          <w:tcPr>
+            <w:tcW w:type="dxa" w:w="1600"/>
+            <w:shd w:fill="F3F7FC" w:color="auto" w:val="clear"/>
+          </w:tcPr>
+          <w:p>
+            <w:pPr>
+              <w:spacing w:after="60" w:line="300"/>
+              <w:jc w:val="left"/>
+            </w:pPr>
+            <w:r>
+              <w:rPr>
+                <w:rFonts w:ascii="Calibri" w:cs="Calibri" w:eastAsia="Calibri" w:hAnsi="Calibri"/>
+                <w:b w:val="false"/>
+                <w:bCs w:val="false"/>
+                <w:color w:val="10213F"/>
+                <w:sz w:val="20"/>
+                <w:szCs w:val="20"/>
+              </w:rPr>
+              <w:t xml:space="preserve">4/4 OK (CP-45 a CP-48)</w:t>
             </w:r>
           </w:p>
         </w:tc>

</xml_diff>